<commit_message>
Day 28: Chapter 5 sections 5.1-5.3 complete
</commit_message>
<xml_diff>
--- a/Thesis-document/BusaniNcube-Thesis.docx
+++ b/Thesis-document/BusaniNcube-Thesis.docx
@@ -9469,19 +9469,10 @@
       <w:pPr>
         <w:spacing w:before="0" w:beforeAutospacing="off" w:after="0" w:afterAutospacing="off"/>
         <w:jc w:val="left"/>
-        <w:rPr>
-          <w:rFonts w:ascii="Times New Roman" w:hAnsi="Times New Roman" w:eastAsia="Times New Roman" w:cs="Times New Roman"/>
-          <w:i w:val="1"/>
-          <w:iCs w:val="1"/>
-          <w:noProof w:val="0"/>
-          <w:sz w:val="22"/>
-          <w:szCs w:val="22"/>
-          <w:lang w:val="en-GB"/>
-        </w:rPr>
       </w:pPr>
       <w:r>
         <w:drawing>
-          <wp:inline wp14:editId="33116F86" wp14:anchorId="28B0008B">
+          <wp:inline wp14:editId="2586B407" wp14:anchorId="28B0008B">
             <wp:extent cx="5953125" cy="2832935"/>
             <wp:effectExtent l="0" t="0" r="0" b="0"/>
             <wp:docPr id="1201634917" name="drawing"/>
@@ -9534,6 +9525,21 @@
         </w:rPr>
         <w:t>[Figure 3 — Settings → About page showing version numbers]</w:t>
       </w:r>
+    </w:p>
+    <w:p>
+      <w:pPr>
+        <w:spacing w:before="0" w:beforeAutospacing="off" w:after="0" w:afterAutospacing="off"/>
+        <w:jc w:val="left"/>
+        <w:rPr>
+          <w:rFonts w:ascii="Times New Roman" w:hAnsi="Times New Roman" w:eastAsia="Times New Roman" w:cs="Times New Roman"/>
+          <w:i w:val="1"/>
+          <w:iCs w:val="1"/>
+          <w:noProof w:val="0"/>
+          <w:sz w:val="22"/>
+          <w:szCs w:val="22"/>
+          <w:lang w:val="en-GB"/>
+        </w:rPr>
+      </w:pPr>
     </w:p>
     <w:p>
       <w:pPr>
@@ -9969,6 +9975,21 @@
       <w:pPr>
         <w:spacing w:before="0" w:beforeAutospacing="off" w:after="0" w:afterAutospacing="off"/>
         <w:jc w:val="left"/>
+        <w:rPr>
+          <w:rFonts w:ascii="Times New Roman" w:hAnsi="Times New Roman" w:eastAsia="Times New Roman" w:cs="Times New Roman"/>
+          <w:i w:val="1"/>
+          <w:iCs w:val="1"/>
+          <w:noProof w:val="0"/>
+          <w:sz w:val="22"/>
+          <w:szCs w:val="22"/>
+          <w:lang w:val="en-GB"/>
+        </w:rPr>
+      </w:pPr>
+    </w:p>
+    <w:p>
+      <w:pPr>
+        <w:spacing w:before="0" w:beforeAutospacing="off" w:after="0" w:afterAutospacing="off"/>
+        <w:jc w:val="left"/>
       </w:pPr>
       <w:r>
         <w:rPr>
@@ -10277,7 +10298,7 @@
       </w:pPr>
       <w:r>
         <w:drawing>
-          <wp:inline wp14:editId="60C43478" wp14:anchorId="67DAAC55">
+          <wp:inline wp14:editId="22E8720D" wp14:anchorId="67DAAC55">
             <wp:extent cx="6153150" cy="3457578"/>
             <wp:effectExtent l="0" t="0" r="0" b="0"/>
             <wp:docPr id="717671094" name="drawing"/>
@@ -10610,7 +10631,7 @@
       </w:pPr>
       <w:r>
         <w:drawing>
-          <wp:inline wp14:editId="31EF11C3" wp14:anchorId="4A5E73AC">
+          <wp:inline wp14:editId="7E8BE824" wp14:anchorId="4A5E73AC">
             <wp:extent cx="4295775" cy="5724525"/>
             <wp:effectExtent l="0" t="0" r="0" b="0"/>
             <wp:docPr id="2061537916" name="drawing"/>
@@ -10821,7 +10842,7 @@
       </w:pPr>
       <w:r>
         <w:drawing>
-          <wp:inline wp14:editId="6163EB5C" wp14:anchorId="25237A25">
+          <wp:inline wp14:editId="7C66DCE0" wp14:anchorId="25237A25">
             <wp:extent cx="6048375" cy="3362325"/>
             <wp:effectExtent l="0" t="0" r="0" b="0"/>
             <wp:docPr id="1835140967" name="drawing"/>
@@ -10924,7 +10945,7 @@
       </w:pPr>
       <w:r>
         <w:drawing>
-          <wp:inline wp14:editId="1C33B93E" wp14:anchorId="3A5CF8EF">
+          <wp:inline wp14:editId="313BD4D0" wp14:anchorId="3A5CF8EF">
             <wp:extent cx="5991225" cy="3648075"/>
             <wp:effectExtent l="0" t="0" r="0" b="0"/>
             <wp:docPr id="863584651" name="drawing"/>
@@ -11135,6 +11156,76 @@
       <w:pPr>
         <w:bidi w:val="0"/>
         <w:jc w:val="left"/>
+        <w:rPr>
+          <w:rFonts w:ascii="Aptos" w:hAnsi="Aptos" w:eastAsia="Aptos" w:cs="Aptos"/>
+          <w:noProof w:val="0"/>
+          <w:sz w:val="24"/>
+          <w:szCs w:val="24"/>
+          <w:lang w:val="en-GB"/>
+        </w:rPr>
+      </w:pPr>
+      <w:r>
+        <w:drawing>
+          <wp:inline wp14:editId="2AE564A6" wp14:anchorId="73242C4B">
+            <wp:extent cx="4295775" cy="5724525"/>
+            <wp:effectExtent l="0" t="0" r="0" b="0"/>
+            <wp:docPr id="1109716701" name="drawing"/>
+            <wp:cNvGraphicFramePr>
+              <a:graphicFrameLocks noChangeAspect="1"/>
+            </wp:cNvGraphicFramePr>
+            <a:graphic>
+              <a:graphicData xmlns:a="http://schemas.openxmlformats.org/drawingml/2006/main" uri="http://schemas.openxmlformats.org/drawingml/2006/picture">
+                <pic:pic xmlns:pic="http://schemas.openxmlformats.org/drawingml/2006/picture">
+                  <pic:nvPicPr>
+                    <pic:cNvPr id="1109716701" name="Picture 1109716701"/>
+                    <pic:cNvPicPr/>
+                  </pic:nvPicPr>
+                  <pic:blipFill>
+                    <a:blip xmlns:r="http://schemas.openxmlformats.org/officeDocument/2006/relationships" r:embed="rId390249109">
+                      <a:extLst>
+                        <a:ext uri="{28A0092B-C50C-407E-A947-70E740481C1C}">
+                          <a14:useLocalDpi xmlns:a14="http://schemas.microsoft.com/office/drawing/2010/main"/>
+                        </a:ext>
+                      </a:extLst>
+                    </a:blip>
+                    <a:stretch>
+                      <a:fillRect/>
+                    </a:stretch>
+                  </pic:blipFill>
+                  <pic:spPr>
+                    <a:xfrm>
+                      <a:off x="0" y="0"/>
+                      <a:ext cx="4295775" cy="5724525"/>
+                    </a:xfrm>
+                    <a:prstGeom prst="rect">
+                      <a:avLst/>
+                    </a:prstGeom>
+                  </pic:spPr>
+                </pic:pic>
+              </a:graphicData>
+            </a:graphic>
+          </wp:inline>
+        </w:drawing>
+      </w:r>
+    </w:p>
+    <w:p>
+      <w:pPr>
+        <w:bidi w:val="0"/>
+        <w:jc w:val="left"/>
+        <w:rPr>
+          <w:rFonts w:ascii="Aptos" w:hAnsi="Aptos" w:eastAsia="Aptos" w:cs="Aptos"/>
+          <w:noProof w:val="0"/>
+          <w:sz w:val="24"/>
+          <w:szCs w:val="24"/>
+          <w:lang w:val="en-GB"/>
+        </w:rPr>
+      </w:pPr>
+    </w:p>
+    <w:p>
+      <w:pPr>
+        <w:pStyle w:val="Normal"/>
+        <w:bidi w:val="0"/>
+        <w:jc w:val="left"/>
       </w:pPr>
       <w:r>
         <w:rPr>
@@ -11146,7 +11237,29 @@
           <w:szCs w:val="24"/>
           <w:lang w:val="en-GB"/>
         </w:rPr>
-        <w:t>[INSERT PHOTO — breadboard wiring of relay module to ESP32]</w:t>
+        <w:t>[</w:t>
+      </w:r>
+      <w:r>
+        <w:rPr>
+          <w:rFonts w:ascii="Aptos" w:hAnsi="Aptos" w:eastAsia="Aptos" w:cs="Aptos"/>
+          <w:noProof w:val="0"/>
+          <w:sz w:val="24"/>
+          <w:szCs w:val="24"/>
+          <w:lang w:val="en-GB"/>
+        </w:rPr>
+        <w:t>Figure 9: Relay module wired to ESP32-WROOM-32 with LED indicator on breadboard</w:t>
+      </w:r>
+      <w:r>
+        <w:rPr>
+          <w:rFonts w:ascii="Aptos" w:hAnsi="Aptos" w:eastAsia="Aptos" w:cs="Aptos"/>
+          <w:i w:val="1"/>
+          <w:iCs w:val="1"/>
+          <w:noProof w:val="0"/>
+          <w:sz w:val="24"/>
+          <w:szCs w:val="24"/>
+          <w:lang w:val="en-GB"/>
+        </w:rPr>
+        <w:t>]</w:t>
       </w:r>
     </w:p>
     <w:p>
@@ -11281,6 +11394,76 @@
       <w:pPr>
         <w:bidi w:val="0"/>
         <w:jc w:val="left"/>
+        <w:rPr>
+          <w:rFonts w:ascii="Aptos" w:hAnsi="Aptos" w:eastAsia="Aptos" w:cs="Aptos"/>
+          <w:noProof w:val="0"/>
+          <w:sz w:val="24"/>
+          <w:szCs w:val="24"/>
+          <w:lang w:val="en-GB"/>
+        </w:rPr>
+      </w:pPr>
+    </w:p>
+    <w:p>
+      <w:pPr>
+        <w:bidi w:val="0"/>
+        <w:jc w:val="left"/>
+        <w:rPr>
+          <w:rFonts w:ascii="Aptos" w:hAnsi="Aptos" w:eastAsia="Aptos" w:cs="Aptos"/>
+          <w:noProof w:val="0"/>
+          <w:sz w:val="24"/>
+          <w:szCs w:val="24"/>
+          <w:lang w:val="en-GB"/>
+        </w:rPr>
+      </w:pPr>
+      <w:r>
+        <w:drawing>
+          <wp:inline wp14:editId="5091CA13" wp14:anchorId="08806049">
+            <wp:extent cx="5724525" cy="2847975"/>
+            <wp:effectExtent l="0" t="0" r="0" b="0"/>
+            <wp:docPr id="1302727904" name="drawing"/>
+            <wp:cNvGraphicFramePr>
+              <a:graphicFrameLocks noChangeAspect="1"/>
+            </wp:cNvGraphicFramePr>
+            <a:graphic>
+              <a:graphicData xmlns:a="http://schemas.openxmlformats.org/drawingml/2006/main" uri="http://schemas.openxmlformats.org/drawingml/2006/picture">
+                <pic:pic xmlns:pic="http://schemas.openxmlformats.org/drawingml/2006/picture">
+                  <pic:nvPicPr>
+                    <pic:cNvPr id="1302727904" name="Picture 1302727904"/>
+                    <pic:cNvPicPr/>
+                  </pic:nvPicPr>
+                  <pic:blipFill>
+                    <a:blip xmlns:r="http://schemas.openxmlformats.org/officeDocument/2006/relationships" r:embed="rId517571538">
+                      <a:extLst>
+                        <a:ext uri="{28A0092B-C50C-407E-A947-70E740481C1C}">
+                          <a14:useLocalDpi xmlns:a14="http://schemas.microsoft.com/office/drawing/2010/main"/>
+                        </a:ext>
+                      </a:extLst>
+                    </a:blip>
+                    <a:stretch>
+                      <a:fillRect/>
+                    </a:stretch>
+                  </pic:blipFill>
+                  <pic:spPr>
+                    <a:xfrm rot="0">
+                      <a:off x="0" y="0"/>
+                      <a:ext cx="5724525" cy="2847975"/>
+                    </a:xfrm>
+                    <a:prstGeom prst="rect">
+                      <a:avLst/>
+                    </a:prstGeom>
+                  </pic:spPr>
+                </pic:pic>
+              </a:graphicData>
+            </a:graphic>
+          </wp:inline>
+        </w:drawing>
+      </w:r>
+    </w:p>
+    <w:p>
+      <w:pPr>
+        <w:pStyle w:val="Normal"/>
+        <w:bidi w:val="0"/>
+        <w:jc w:val="left"/>
       </w:pPr>
       <w:r>
         <w:rPr>
@@ -11292,8 +11475,184 @@
           <w:szCs w:val="24"/>
           <w:lang w:val="en-GB"/>
         </w:rPr>
-        <w:t>[INSERT SCREENSHOT — HA dashboard showing relay switch card toggled ON]</w:t>
-      </w:r>
+        <w:t>[</w:t>
+      </w:r>
+      <w:r>
+        <w:rPr>
+          <w:rFonts w:ascii="Aptos" w:hAnsi="Aptos" w:eastAsia="Aptos" w:cs="Aptos"/>
+          <w:noProof w:val="0"/>
+          <w:sz w:val="24"/>
+          <w:szCs w:val="24"/>
+          <w:lang w:val="en-GB"/>
+        </w:rPr>
+        <w:t>Figure 10a: Smart Home Controller dashboard showing Smart Relay 1 toggled ON</w:t>
+      </w:r>
+      <w:r>
+        <w:rPr>
+          <w:rFonts w:ascii="Aptos" w:hAnsi="Aptos" w:eastAsia="Aptos" w:cs="Aptos"/>
+          <w:i w:val="1"/>
+          <w:iCs w:val="1"/>
+          <w:noProof w:val="0"/>
+          <w:sz w:val="24"/>
+          <w:szCs w:val="24"/>
+          <w:lang w:val="en-GB"/>
+        </w:rPr>
+        <w:t>]</w:t>
+      </w:r>
+    </w:p>
+    <w:p>
+      <w:pPr>
+        <w:pStyle w:val="Normal"/>
+        <w:bidi w:val="0"/>
+        <w:jc w:val="left"/>
+        <w:rPr>
+          <w:rFonts w:ascii="Aptos" w:hAnsi="Aptos" w:eastAsia="Aptos" w:cs="Aptos"/>
+          <w:i w:val="1"/>
+          <w:iCs w:val="1"/>
+          <w:noProof w:val="0"/>
+          <w:sz w:val="24"/>
+          <w:szCs w:val="24"/>
+          <w:lang w:val="en-GB"/>
+        </w:rPr>
+      </w:pPr>
+    </w:p>
+    <w:p>
+      <w:pPr>
+        <w:pStyle w:val="Normal"/>
+        <w:bidi w:val="0"/>
+        <w:jc w:val="left"/>
+        <w:rPr>
+          <w:rFonts w:ascii="Aptos" w:hAnsi="Aptos" w:eastAsia="Aptos" w:cs="Aptos"/>
+          <w:i w:val="1"/>
+          <w:iCs w:val="1"/>
+          <w:noProof w:val="0"/>
+          <w:sz w:val="24"/>
+          <w:szCs w:val="24"/>
+          <w:lang w:val="en-GB"/>
+        </w:rPr>
+      </w:pPr>
+    </w:p>
+    <w:p>
+      <w:pPr>
+        <w:pStyle w:val="Normal"/>
+        <w:suppressLineNumbers w:val="0"/>
+        <w:bidi w:val="0"/>
+        <w:spacing w:before="0" w:beforeAutospacing="off" w:after="160" w:afterAutospacing="off" w:line="279" w:lineRule="auto"/>
+        <w:ind w:left="0" w:right="0"/>
+        <w:jc w:val="left"/>
+        <w:rPr>
+          <w:rFonts w:ascii="Aptos" w:hAnsi="Aptos" w:eastAsia="Aptos" w:cs="Aptos"/>
+          <w:i w:val="1"/>
+          <w:iCs w:val="1"/>
+          <w:noProof w:val="0"/>
+          <w:sz w:val="24"/>
+          <w:szCs w:val="24"/>
+          <w:lang w:val="en-GB"/>
+        </w:rPr>
+      </w:pPr>
+      <w:r>
+        <w:drawing>
+          <wp:inline wp14:editId="6A214E9C" wp14:anchorId="3FA87928">
+            <wp:extent cx="4295775" cy="5724525"/>
+            <wp:effectExtent l="0" t="0" r="0" b="0"/>
+            <wp:docPr id="1590265642" name="drawing"/>
+            <wp:cNvGraphicFramePr>
+              <a:graphicFrameLocks noChangeAspect="1"/>
+            </wp:cNvGraphicFramePr>
+            <a:graphic>
+              <a:graphicData xmlns:a="http://schemas.openxmlformats.org/drawingml/2006/main" uri="http://schemas.openxmlformats.org/drawingml/2006/picture">
+                <pic:pic xmlns:pic="http://schemas.openxmlformats.org/drawingml/2006/picture">
+                  <pic:nvPicPr>
+                    <pic:cNvPr id="1590265642" name="Picture 1590265642"/>
+                    <pic:cNvPicPr/>
+                  </pic:nvPicPr>
+                  <pic:blipFill>
+                    <a:blip xmlns:r="http://schemas.openxmlformats.org/officeDocument/2006/relationships" r:embed="rId2100486685">
+                      <a:extLst>
+                        <a:ext uri="{28A0092B-C50C-407E-A947-70E740481C1C}">
+                          <a14:useLocalDpi xmlns:a14="http://schemas.microsoft.com/office/drawing/2010/main"/>
+                        </a:ext>
+                      </a:extLst>
+                    </a:blip>
+                    <a:stretch>
+                      <a:fillRect/>
+                    </a:stretch>
+                  </pic:blipFill>
+                  <pic:spPr>
+                    <a:xfrm>
+                      <a:off x="0" y="0"/>
+                      <a:ext cx="4295775" cy="5724525"/>
+                    </a:xfrm>
+                    <a:prstGeom prst="rect">
+                      <a:avLst/>
+                    </a:prstGeom>
+                  </pic:spPr>
+                </pic:pic>
+              </a:graphicData>
+            </a:graphic>
+          </wp:inline>
+        </w:drawing>
+      </w:r>
+    </w:p>
+    <w:p>
+      <w:pPr>
+        <w:pStyle w:val="Normal"/>
+        <w:suppressLineNumbers w:val="0"/>
+        <w:bidi w:val="0"/>
+        <w:spacing w:before="0" w:beforeAutospacing="off" w:after="160" w:afterAutospacing="off" w:line="279" w:lineRule="auto"/>
+        <w:ind w:left="0" w:right="0"/>
+        <w:jc w:val="left"/>
+      </w:pPr>
+      <w:r>
+        <w:rPr>
+          <w:rFonts w:ascii="Aptos" w:hAnsi="Aptos" w:eastAsia="Aptos" w:cs="Aptos"/>
+          <w:i w:val="1"/>
+          <w:iCs w:val="1"/>
+          <w:noProof w:val="0"/>
+          <w:sz w:val="24"/>
+          <w:szCs w:val="24"/>
+          <w:lang w:val="en-GB"/>
+        </w:rPr>
+        <w:t>[</w:t>
+      </w:r>
+      <w:r>
+        <w:rPr>
+          <w:rFonts w:ascii="Aptos" w:hAnsi="Aptos" w:eastAsia="Aptos" w:cs="Aptos"/>
+          <w:noProof w:val="0"/>
+          <w:sz w:val="24"/>
+          <w:szCs w:val="24"/>
+          <w:lang w:val="en-GB"/>
+        </w:rPr>
+        <w:t>Figure 10b: LED light powered on</w:t>
+      </w:r>
+      <w:r>
+        <w:rPr>
+          <w:rFonts w:ascii="Aptos" w:hAnsi="Aptos" w:eastAsia="Aptos" w:cs="Aptos"/>
+          <w:i w:val="1"/>
+          <w:iCs w:val="1"/>
+          <w:noProof w:val="0"/>
+          <w:sz w:val="24"/>
+          <w:szCs w:val="24"/>
+          <w:lang w:val="en-GB"/>
+        </w:rPr>
+        <w:t>]</w:t>
+      </w:r>
+    </w:p>
+    <w:p>
+      <w:pPr>
+        <w:pStyle w:val="Normal"/>
+        <w:bidi w:val="0"/>
+        <w:jc w:val="left"/>
+        <w:rPr>
+          <w:rFonts w:ascii="Aptos" w:hAnsi="Aptos" w:eastAsia="Aptos" w:cs="Aptos"/>
+          <w:i w:val="1"/>
+          <w:iCs w:val="1"/>
+          <w:noProof w:val="0"/>
+          <w:sz w:val="24"/>
+          <w:szCs w:val="24"/>
+          <w:lang w:val="en-GB"/>
+        </w:rPr>
+      </w:pPr>
     </w:p>
     <w:p>
       <w:pPr>
@@ -11396,7 +11755,7 @@
       </w:pPr>
       <w:r>
         <w:drawing>
-          <wp:inline wp14:editId="306E9990" wp14:anchorId="41063EF8">
+          <wp:inline wp14:editId="12AB6BEC" wp14:anchorId="41063EF8">
             <wp:extent cx="5724525" cy="3200400"/>
             <wp:effectExtent l="0" t="0" r="0" b="0"/>
             <wp:docPr id="1679965395" name="drawing"/>
@@ -11554,7 +11913,7 @@
       </w:pPr>
       <w:r>
         <w:drawing>
-          <wp:inline wp14:editId="3CD1925B" wp14:anchorId="08052853">
+          <wp:inline wp14:editId="06ECCEF0" wp14:anchorId="08052853">
             <wp:extent cx="5619750" cy="3152355"/>
             <wp:effectExtent l="0" t="0" r="0" b="0"/>
             <wp:docPr id="1903956737" name="drawing"/>
@@ -12178,6 +12537,2095 @@
         </w:rPr>
         <w:t>Each ESP32 connects to the Mosquitto broker on startup using the mqtt_user credentials. Sensor readings are published to their respective state topics every 10 seconds. Home Assistant subscribes to all sensor topics and updates entity states in real time. Control commands for the relay are published by Home Assistant to the command topic, and the ESP32 confirms the action by publishing the new state back. All communication occurs entirely on the local network with no external internet dependency.</w:t>
       </w:r>
+    </w:p>
+    <w:p>
+      <w:pPr>
+        <w:jc w:val="left"/>
+        <w:rPr>
+          <w:rFonts w:ascii="Times New Roman" w:hAnsi="Times New Roman" w:eastAsia="Times New Roman" w:cs="Times New Roman"/>
+          <w:noProof w:val="0"/>
+          <w:sz w:val="22"/>
+          <w:szCs w:val="22"/>
+          <w:lang w:val="en-GB"/>
+        </w:rPr>
+      </w:pPr>
+    </w:p>
+    <w:p>
+      <w:pPr>
+        <w:jc w:val="left"/>
+      </w:pPr>
+      <w:r>
+        <w:rPr>
+          <w:rFonts w:ascii="Times New Roman" w:hAnsi="Times New Roman" w:eastAsia="Times New Roman" w:cs="Times New Roman"/>
+          <w:b w:val="1"/>
+          <w:bCs w:val="1"/>
+          <w:noProof w:val="0"/>
+          <w:sz w:val="22"/>
+          <w:szCs w:val="22"/>
+          <w:lang w:val="en-GB"/>
+        </w:rPr>
+        <w:t>4.7 Automation Implementation</w:t>
+      </w:r>
+    </w:p>
+    <w:p>
+      <w:pPr>
+        <w:jc w:val="left"/>
+      </w:pPr>
+      <w:r>
+        <w:rPr>
+          <w:rFonts w:ascii="Times New Roman" w:hAnsi="Times New Roman" w:eastAsia="Times New Roman" w:cs="Times New Roman"/>
+          <w:noProof w:val="0"/>
+          <w:sz w:val="22"/>
+          <w:szCs w:val="22"/>
+          <w:lang w:val="en-GB"/>
+        </w:rPr>
+        <w:t>Five automations were configured in Home Assistant using the visual automation editor to demonstrate the system's ability to respond intelligently to sensor data and scheduled triggers. Each automation follows a trigger-condition-action structure and was tested to confirm correct behaviour. Screenshots of each automation configuration are shown in Figures 13-17.</w:t>
+      </w:r>
+    </w:p>
+    <w:p>
+      <w:pPr>
+        <w:jc w:val="left"/>
+      </w:pPr>
+      <w:r>
+        <w:rPr>
+          <w:rFonts w:ascii="Times New Roman" w:hAnsi="Times New Roman" w:eastAsia="Times New Roman" w:cs="Times New Roman"/>
+          <w:b w:val="1"/>
+          <w:bCs w:val="1"/>
+          <w:noProof w:val="0"/>
+          <w:sz w:val="22"/>
+          <w:szCs w:val="22"/>
+          <w:lang w:val="en-GB"/>
+        </w:rPr>
+        <w:t>Automation 1 — Motion and Light Triggered Relay</w:t>
+      </w:r>
+    </w:p>
+    <w:p>
+      <w:pPr>
+        <w:jc w:val="left"/>
+      </w:pPr>
+      <w:r>
+        <w:rPr>
+          <w:rFonts w:ascii="Times New Roman" w:hAnsi="Times New Roman" w:eastAsia="Times New Roman" w:cs="Times New Roman"/>
+          <w:noProof w:val="0"/>
+          <w:sz w:val="22"/>
+          <w:szCs w:val="22"/>
+          <w:lang w:val="en-GB"/>
+        </w:rPr>
+        <w:t>This automation activates the relay when two conditions are met simultaneously: the PIR sensor detects motion and the ambient light level falls below 100 lux. The trigger is set to the PIR Motion Sensor entity changing state to Detected. The condition checks that the BH1750 Light Sensor reading is below 100 lux, ensuring the relay only activates when the environment is dark enough to require lighting. The action switches Smart Relay 1 to ON, physically closing the relay circuit and lighting the connected LED. This automation was triggered naturally during testing when evening light levels dropped below the threshold while motion was detected, confirming it responds correctly to real environmental conditions rather than only forced test scenarios.</w:t>
+      </w:r>
+    </w:p>
+    <w:p>
+      <w:pPr>
+        <w:jc w:val="left"/>
+        <w:rPr>
+          <w:rFonts w:ascii="Times New Roman" w:hAnsi="Times New Roman" w:eastAsia="Times New Roman" w:cs="Times New Roman"/>
+          <w:noProof w:val="0"/>
+          <w:sz w:val="22"/>
+          <w:szCs w:val="22"/>
+          <w:lang w:val="en-GB"/>
+        </w:rPr>
+      </w:pPr>
+      <w:r>
+        <w:drawing>
+          <wp:inline wp14:editId="00355E51" wp14:anchorId="0A6A793D">
+            <wp:extent cx="5724525" cy="2714625"/>
+            <wp:effectExtent l="0" t="0" r="0" b="0"/>
+            <wp:docPr id="1388814413" name="drawing"/>
+            <wp:cNvGraphicFramePr>
+              <a:graphicFrameLocks noChangeAspect="1"/>
+            </wp:cNvGraphicFramePr>
+            <a:graphic>
+              <a:graphicData xmlns:a="http://schemas.openxmlformats.org/drawingml/2006/main" uri="http://schemas.openxmlformats.org/drawingml/2006/picture">
+                <pic:pic xmlns:pic="http://schemas.openxmlformats.org/drawingml/2006/picture">
+                  <pic:nvPicPr>
+                    <pic:cNvPr id="1388814413" name="Picture 1388814413"/>
+                    <pic:cNvPicPr/>
+                  </pic:nvPicPr>
+                  <pic:blipFill>
+                    <a:blip xmlns:r="http://schemas.openxmlformats.org/officeDocument/2006/relationships" r:embed="rId1004867318">
+                      <a:extLst>
+                        <a:ext uri="{28A0092B-C50C-407E-A947-70E740481C1C}">
+                          <a14:useLocalDpi xmlns:a14="http://schemas.microsoft.com/office/drawing/2010/main"/>
+                        </a:ext>
+                      </a:extLst>
+                    </a:blip>
+                    <a:stretch>
+                      <a:fillRect/>
+                    </a:stretch>
+                  </pic:blipFill>
+                  <pic:spPr>
+                    <a:xfrm>
+                      <a:off x="0" y="0"/>
+                      <a:ext cx="5724525" cy="2714625"/>
+                    </a:xfrm>
+                    <a:prstGeom prst="rect">
+                      <a:avLst/>
+                    </a:prstGeom>
+                  </pic:spPr>
+                </pic:pic>
+              </a:graphicData>
+            </a:graphic>
+          </wp:inline>
+        </w:drawing>
+      </w:r>
+    </w:p>
+    <w:p>
+      <w:pPr>
+        <w:pStyle w:val="Normal"/>
+        <w:suppressLineNumbers w:val="0"/>
+        <w:bidi w:val="0"/>
+        <w:spacing w:before="0" w:beforeAutospacing="off" w:after="160" w:afterAutospacing="off" w:line="279" w:lineRule="auto"/>
+        <w:ind w:left="0" w:right="0"/>
+        <w:jc w:val="left"/>
+      </w:pPr>
+      <w:r>
+        <w:rPr>
+          <w:rFonts w:ascii="Times New Roman" w:hAnsi="Times New Roman" w:eastAsia="Times New Roman" w:cs="Times New Roman"/>
+          <w:i w:val="1"/>
+          <w:iCs w:val="1"/>
+          <w:noProof w:val="0"/>
+          <w:sz w:val="22"/>
+          <w:szCs w:val="22"/>
+          <w:lang w:val="en-GB"/>
+        </w:rPr>
+        <w:t>[</w:t>
+      </w:r>
+      <w:r>
+        <w:rPr>
+          <w:rFonts w:ascii="Times New Roman" w:hAnsi="Times New Roman" w:eastAsia="Times New Roman" w:cs="Times New Roman"/>
+          <w:i w:val="1"/>
+          <w:iCs w:val="1"/>
+          <w:noProof w:val="0"/>
+          <w:sz w:val="22"/>
+          <w:szCs w:val="22"/>
+          <w:lang w:val="en-GB"/>
+        </w:rPr>
+        <w:t xml:space="preserve">Figure 13 </w:t>
+      </w:r>
+      <w:r>
+        <w:rPr>
+          <w:rFonts w:ascii="Times New Roman" w:hAnsi="Times New Roman" w:eastAsia="Times New Roman" w:cs="Times New Roman"/>
+          <w:i w:val="1"/>
+          <w:iCs w:val="1"/>
+          <w:noProof w:val="0"/>
+          <w:sz w:val="22"/>
+          <w:szCs w:val="22"/>
+          <w:lang w:val="en-GB"/>
+        </w:rPr>
+        <w:t>— Automation 1 configuration showing PIR trigger, light condition, relay action]</w:t>
+      </w:r>
+    </w:p>
+    <w:p>
+      <w:pPr>
+        <w:jc w:val="left"/>
+      </w:pPr>
+      <w:r>
+        <w:rPr>
+          <w:rFonts w:ascii="Times New Roman" w:hAnsi="Times New Roman" w:eastAsia="Times New Roman" w:cs="Times New Roman"/>
+          <w:b w:val="1"/>
+          <w:bCs w:val="1"/>
+          <w:noProof w:val="0"/>
+          <w:sz w:val="22"/>
+          <w:szCs w:val="22"/>
+          <w:lang w:val="en-GB"/>
+        </w:rPr>
+        <w:t>Automation 2 — Temperature Alert</w:t>
+      </w:r>
+    </w:p>
+    <w:p>
+      <w:pPr>
+        <w:jc w:val="left"/>
+      </w:pPr>
+      <w:r>
+        <w:rPr>
+          <w:rFonts w:ascii="Times New Roman" w:hAnsi="Times New Roman" w:eastAsia="Times New Roman" w:cs="Times New Roman"/>
+          <w:noProof w:val="0"/>
+          <w:sz w:val="22"/>
+          <w:szCs w:val="22"/>
+          <w:lang w:val="en-GB"/>
+        </w:rPr>
+        <w:t>This automation sends a push notification to the registered mobile device when the ESP32 internal temperature sensor exceeds a defined threshold. The trigger monitors the ESP32 Temperature entity and fires when the value crosses the set threshold. The action calls the notify.mobile_app_busani service with the message "Temperature threshold exceeded" and title "Smart Home Alert". The notification was confirmed received on the mobile device during testing as shown in Figure 14.</w:t>
+      </w:r>
+    </w:p>
+    <w:p>
+      <w:pPr>
+        <w:jc w:val="left"/>
+        <w:rPr>
+          <w:rFonts w:ascii="Times New Roman" w:hAnsi="Times New Roman" w:eastAsia="Times New Roman" w:cs="Times New Roman"/>
+          <w:noProof w:val="0"/>
+          <w:sz w:val="22"/>
+          <w:szCs w:val="22"/>
+          <w:lang w:val="en-GB"/>
+        </w:rPr>
+      </w:pPr>
+    </w:p>
+    <w:p>
+      <w:pPr>
+        <w:spacing w:before="0" w:beforeAutospacing="off" w:after="160" w:afterAutospacing="off" w:line="279" w:lineRule="auto"/>
+        <w:ind w:left="0" w:right="0"/>
+        <w:jc w:val="left"/>
+      </w:pPr>
+      <w:r>
+        <w:drawing>
+          <wp:inline wp14:editId="1F23C849" wp14:anchorId="345BE6AA">
+            <wp:extent cx="5724525" cy="2714625"/>
+            <wp:effectExtent l="0" t="0" r="0" b="0"/>
+            <wp:docPr id="2115615694" name="drawing"/>
+            <wp:cNvGraphicFramePr>
+              <a:graphicFrameLocks noChangeAspect="1"/>
+            </wp:cNvGraphicFramePr>
+            <a:graphic>
+              <a:graphicData xmlns:a="http://schemas.openxmlformats.org/drawingml/2006/main" uri="http://schemas.openxmlformats.org/drawingml/2006/picture">
+                <pic:pic xmlns:pic="http://schemas.openxmlformats.org/drawingml/2006/picture">
+                  <pic:nvPicPr>
+                    <pic:cNvPr id="2115615694" name="Picture 2115615694"/>
+                    <pic:cNvPicPr/>
+                  </pic:nvPicPr>
+                  <pic:blipFill>
+                    <a:blip xmlns:r="http://schemas.openxmlformats.org/officeDocument/2006/relationships" r:embed="rId523587774">
+                      <a:extLst>
+                        <a:ext uri="{28A0092B-C50C-407E-A947-70E740481C1C}">
+                          <a14:useLocalDpi xmlns:a14="http://schemas.microsoft.com/office/drawing/2010/main"/>
+                        </a:ext>
+                      </a:extLst>
+                    </a:blip>
+                    <a:stretch>
+                      <a:fillRect/>
+                    </a:stretch>
+                  </pic:blipFill>
+                  <pic:spPr>
+                    <a:xfrm>
+                      <a:off x="0" y="0"/>
+                      <a:ext cx="5724525" cy="2714625"/>
+                    </a:xfrm>
+                    <a:prstGeom prst="rect">
+                      <a:avLst/>
+                    </a:prstGeom>
+                  </pic:spPr>
+                </pic:pic>
+              </a:graphicData>
+            </a:graphic>
+          </wp:inline>
+        </w:drawing>
+      </w:r>
+    </w:p>
+    <w:p>
+      <w:pPr>
+        <w:spacing w:before="0" w:beforeAutospacing="off" w:after="160" w:afterAutospacing="off" w:line="279" w:lineRule="auto"/>
+        <w:ind w:left="0" w:right="0"/>
+        <w:jc w:val="left"/>
+      </w:pPr>
+      <w:r>
+        <w:rPr>
+          <w:rFonts w:ascii="Times New Roman" w:hAnsi="Times New Roman" w:eastAsia="Times New Roman" w:cs="Times New Roman"/>
+          <w:i w:val="1"/>
+          <w:iCs w:val="1"/>
+          <w:noProof w:val="0"/>
+          <w:sz w:val="22"/>
+          <w:szCs w:val="22"/>
+          <w:lang w:val="en-GB"/>
+        </w:rPr>
+        <w:t>[Figure 14a — Automation 2 configuration]</w:t>
+      </w:r>
+    </w:p>
+    <w:p>
+      <w:pPr>
+        <w:jc w:val="left"/>
+        <w:rPr>
+          <w:rFonts w:ascii="Times New Roman" w:hAnsi="Times New Roman" w:eastAsia="Times New Roman" w:cs="Times New Roman"/>
+          <w:noProof w:val="0"/>
+          <w:sz w:val="22"/>
+          <w:szCs w:val="22"/>
+          <w:lang w:val="en-GB"/>
+        </w:rPr>
+      </w:pPr>
+    </w:p>
+    <w:p>
+      <w:pPr>
+        <w:jc w:val="left"/>
+        <w:rPr>
+          <w:rFonts w:ascii="Times New Roman" w:hAnsi="Times New Roman" w:eastAsia="Times New Roman" w:cs="Times New Roman"/>
+          <w:noProof w:val="0"/>
+          <w:sz w:val="22"/>
+          <w:szCs w:val="22"/>
+          <w:lang w:val="en-GB"/>
+        </w:rPr>
+      </w:pPr>
+      <w:r>
+        <w:drawing>
+          <wp:inline wp14:editId="6CBA2452" wp14:anchorId="4224CA68">
+            <wp:extent cx="2647950" cy="5724525"/>
+            <wp:effectExtent l="0" t="0" r="0" b="0"/>
+            <wp:docPr id="110524008" name="drawing"/>
+            <wp:cNvGraphicFramePr>
+              <a:graphicFrameLocks noChangeAspect="1"/>
+            </wp:cNvGraphicFramePr>
+            <a:graphic>
+              <a:graphicData xmlns:a="http://schemas.openxmlformats.org/drawingml/2006/main" uri="http://schemas.openxmlformats.org/drawingml/2006/picture">
+                <pic:pic xmlns:pic="http://schemas.openxmlformats.org/drawingml/2006/picture">
+                  <pic:nvPicPr>
+                    <pic:cNvPr id="110524008" name="Picture 110524008"/>
+                    <pic:cNvPicPr/>
+                  </pic:nvPicPr>
+                  <pic:blipFill>
+                    <a:blip xmlns:r="http://schemas.openxmlformats.org/officeDocument/2006/relationships" r:embed="rId897564055">
+                      <a:extLst>
+                        <a:ext uri="{28A0092B-C50C-407E-A947-70E740481C1C}">
+                          <a14:useLocalDpi xmlns:a14="http://schemas.microsoft.com/office/drawing/2010/main"/>
+                        </a:ext>
+                      </a:extLst>
+                    </a:blip>
+                    <a:stretch>
+                      <a:fillRect/>
+                    </a:stretch>
+                  </pic:blipFill>
+                  <pic:spPr>
+                    <a:xfrm>
+                      <a:off x="0" y="0"/>
+                      <a:ext cx="2647950" cy="5724525"/>
+                    </a:xfrm>
+                    <a:prstGeom prst="rect">
+                      <a:avLst/>
+                    </a:prstGeom>
+                  </pic:spPr>
+                </pic:pic>
+              </a:graphicData>
+            </a:graphic>
+          </wp:inline>
+        </w:drawing>
+      </w:r>
+    </w:p>
+    <w:p>
+      <w:pPr>
+        <w:pStyle w:val="Normal"/>
+        <w:suppressLineNumbers w:val="0"/>
+        <w:bidi w:val="0"/>
+        <w:spacing w:before="0" w:beforeAutospacing="off" w:after="160" w:afterAutospacing="off" w:line="279" w:lineRule="auto"/>
+        <w:ind w:left="0" w:right="0"/>
+        <w:jc w:val="left"/>
+      </w:pPr>
+      <w:r>
+        <w:rPr>
+          <w:rFonts w:ascii="Times New Roman" w:hAnsi="Times New Roman" w:eastAsia="Times New Roman" w:cs="Times New Roman"/>
+          <w:i w:val="1"/>
+          <w:iCs w:val="1"/>
+          <w:noProof w:val="0"/>
+          <w:sz w:val="22"/>
+          <w:szCs w:val="22"/>
+          <w:lang w:val="en-GB"/>
+        </w:rPr>
+        <w:t>[</w:t>
+      </w:r>
+      <w:r>
+        <w:rPr>
+          <w:rFonts w:ascii="Times New Roman" w:hAnsi="Times New Roman" w:eastAsia="Times New Roman" w:cs="Times New Roman"/>
+          <w:i w:val="1"/>
+          <w:iCs w:val="1"/>
+          <w:noProof w:val="0"/>
+          <w:sz w:val="22"/>
+          <w:szCs w:val="22"/>
+          <w:lang w:val="en-GB"/>
+        </w:rPr>
+        <w:t>Figure 14b</w:t>
+      </w:r>
+      <w:r>
+        <w:rPr>
+          <w:rFonts w:ascii="Times New Roman" w:hAnsi="Times New Roman" w:eastAsia="Times New Roman" w:cs="Times New Roman"/>
+          <w:i w:val="1"/>
+          <w:iCs w:val="1"/>
+          <w:noProof w:val="0"/>
+          <w:sz w:val="22"/>
+          <w:szCs w:val="22"/>
+          <w:lang w:val="en-GB"/>
+        </w:rPr>
+        <w:t xml:space="preserve"> — Automation 2 </w:t>
+      </w:r>
+      <w:r>
+        <w:rPr>
+          <w:rFonts w:ascii="Times New Roman" w:hAnsi="Times New Roman" w:eastAsia="Times New Roman" w:cs="Times New Roman"/>
+          <w:i w:val="1"/>
+          <w:iCs w:val="1"/>
+          <w:noProof w:val="0"/>
+          <w:sz w:val="22"/>
+          <w:szCs w:val="22"/>
+          <w:lang w:val="en-GB"/>
+        </w:rPr>
+        <w:t>notification</w:t>
+      </w:r>
+      <w:r>
+        <w:rPr>
+          <w:rFonts w:ascii="Times New Roman" w:hAnsi="Times New Roman" w:eastAsia="Times New Roman" w:cs="Times New Roman"/>
+          <w:i w:val="1"/>
+          <w:iCs w:val="1"/>
+          <w:noProof w:val="0"/>
+          <w:sz w:val="22"/>
+          <w:szCs w:val="22"/>
+          <w:lang w:val="en-GB"/>
+        </w:rPr>
+        <w:t>]</w:t>
+      </w:r>
+    </w:p>
+    <w:p>
+      <w:pPr>
+        <w:jc w:val="left"/>
+      </w:pPr>
+      <w:r>
+        <w:rPr>
+          <w:rFonts w:ascii="Times New Roman" w:hAnsi="Times New Roman" w:eastAsia="Times New Roman" w:cs="Times New Roman"/>
+          <w:b w:val="1"/>
+          <w:bCs w:val="1"/>
+          <w:noProof w:val="0"/>
+          <w:sz w:val="22"/>
+          <w:szCs w:val="22"/>
+          <w:lang w:val="en-GB"/>
+        </w:rPr>
+        <w:t>Automation 3 — Motion Alert</w:t>
+      </w:r>
+    </w:p>
+    <w:p>
+      <w:pPr>
+        <w:jc w:val="left"/>
+      </w:pPr>
+      <w:r>
+        <w:rPr>
+          <w:rFonts w:ascii="Times New Roman" w:hAnsi="Times New Roman" w:eastAsia="Times New Roman" w:cs="Times New Roman"/>
+          <w:noProof w:val="0"/>
+          <w:sz w:val="22"/>
+          <w:szCs w:val="22"/>
+          <w:lang w:val="en-GB"/>
+        </w:rPr>
+        <w:t>This automation sends a push notification when the PIR Motion Sensor detects motion. It uses the same notification service as Automation 2 but is triggered by the PIR entity changing to Detected state. The message reads "Motion detected at home!" confirming occupancy to the user remotely. This automation is kept disabled during normal operation to prevent excessive notifications during testing and is enabled specifically for demonstration purposes.</w:t>
+      </w:r>
+    </w:p>
+    <w:p>
+      <w:pPr>
+        <w:jc w:val="left"/>
+        <w:rPr>
+          <w:rFonts w:ascii="Times New Roman" w:hAnsi="Times New Roman" w:eastAsia="Times New Roman" w:cs="Times New Roman"/>
+          <w:noProof w:val="0"/>
+          <w:sz w:val="22"/>
+          <w:szCs w:val="22"/>
+          <w:lang w:val="en-GB"/>
+        </w:rPr>
+      </w:pPr>
+      <w:r>
+        <w:drawing>
+          <wp:inline wp14:editId="27FEFA5C" wp14:anchorId="29AEFE28">
+            <wp:extent cx="5724525" cy="2724150"/>
+            <wp:effectExtent l="0" t="0" r="0" b="0"/>
+            <wp:docPr id="2040029155" name="drawing"/>
+            <wp:cNvGraphicFramePr>
+              <a:graphicFrameLocks noChangeAspect="1"/>
+            </wp:cNvGraphicFramePr>
+            <a:graphic>
+              <a:graphicData xmlns:a="http://schemas.openxmlformats.org/drawingml/2006/main" uri="http://schemas.openxmlformats.org/drawingml/2006/picture">
+                <pic:pic xmlns:pic="http://schemas.openxmlformats.org/drawingml/2006/picture">
+                  <pic:nvPicPr>
+                    <pic:cNvPr id="2040029155" name="Picture 2040029155"/>
+                    <pic:cNvPicPr/>
+                  </pic:nvPicPr>
+                  <pic:blipFill>
+                    <a:blip xmlns:r="http://schemas.openxmlformats.org/officeDocument/2006/relationships" r:embed="rId1387438693">
+                      <a:extLst>
+                        <a:ext uri="{28A0092B-C50C-407E-A947-70E740481C1C}">
+                          <a14:useLocalDpi xmlns:a14="http://schemas.microsoft.com/office/drawing/2010/main"/>
+                        </a:ext>
+                      </a:extLst>
+                    </a:blip>
+                    <a:stretch>
+                      <a:fillRect/>
+                    </a:stretch>
+                  </pic:blipFill>
+                  <pic:spPr>
+                    <a:xfrm>
+                      <a:off x="0" y="0"/>
+                      <a:ext cx="5724525" cy="2724150"/>
+                    </a:xfrm>
+                    <a:prstGeom prst="rect">
+                      <a:avLst/>
+                    </a:prstGeom>
+                  </pic:spPr>
+                </pic:pic>
+              </a:graphicData>
+            </a:graphic>
+          </wp:inline>
+        </w:drawing>
+      </w:r>
+    </w:p>
+    <w:p>
+      <w:pPr>
+        <w:pStyle w:val="Normal"/>
+        <w:suppressLineNumbers w:val="0"/>
+        <w:bidi w:val="0"/>
+        <w:spacing w:before="0" w:beforeAutospacing="off" w:after="160" w:afterAutospacing="off" w:line="279" w:lineRule="auto"/>
+        <w:ind w:left="0" w:right="0"/>
+        <w:jc w:val="left"/>
+      </w:pPr>
+      <w:r>
+        <w:rPr>
+          <w:rFonts w:ascii="Times New Roman" w:hAnsi="Times New Roman" w:eastAsia="Times New Roman" w:cs="Times New Roman"/>
+          <w:i w:val="1"/>
+          <w:iCs w:val="1"/>
+          <w:noProof w:val="0"/>
+          <w:sz w:val="22"/>
+          <w:szCs w:val="22"/>
+          <w:lang w:val="en-GB"/>
+        </w:rPr>
+        <w:t>[</w:t>
+      </w:r>
+      <w:r>
+        <w:rPr>
+          <w:rFonts w:ascii="Times New Roman" w:hAnsi="Times New Roman" w:eastAsia="Times New Roman" w:cs="Times New Roman"/>
+          <w:i w:val="1"/>
+          <w:iCs w:val="1"/>
+          <w:noProof w:val="0"/>
+          <w:sz w:val="22"/>
+          <w:szCs w:val="22"/>
+          <w:lang w:val="en-GB"/>
+        </w:rPr>
+        <w:t>Figure 15</w:t>
+      </w:r>
+      <w:r>
+        <w:rPr>
+          <w:rFonts w:ascii="Times New Roman" w:hAnsi="Times New Roman" w:eastAsia="Times New Roman" w:cs="Times New Roman"/>
+          <w:i w:val="1"/>
+          <w:iCs w:val="1"/>
+          <w:noProof w:val="0"/>
+          <w:sz w:val="22"/>
+          <w:szCs w:val="22"/>
+          <w:lang w:val="en-GB"/>
+        </w:rPr>
+        <w:t xml:space="preserve"> — Automation 3 configuration]</w:t>
+      </w:r>
+    </w:p>
+    <w:p>
+      <w:pPr>
+        <w:jc w:val="left"/>
+      </w:pPr>
+      <w:r>
+        <w:rPr>
+          <w:rFonts w:ascii="Times New Roman" w:hAnsi="Times New Roman" w:eastAsia="Times New Roman" w:cs="Times New Roman"/>
+          <w:b w:val="1"/>
+          <w:bCs w:val="1"/>
+          <w:noProof w:val="0"/>
+          <w:sz w:val="22"/>
+          <w:szCs w:val="22"/>
+          <w:lang w:val="en-GB"/>
+        </w:rPr>
+        <w:t>Automation 4 — Scheduled Relay Off</w:t>
+      </w:r>
+    </w:p>
+    <w:p>
+      <w:pPr>
+        <w:jc w:val="left"/>
+      </w:pPr>
+      <w:r>
+        <w:rPr>
+          <w:rFonts w:ascii="Times New Roman" w:hAnsi="Times New Roman" w:eastAsia="Times New Roman" w:cs="Times New Roman"/>
+          <w:noProof w:val="0"/>
+          <w:sz w:val="22"/>
+          <w:szCs w:val="22"/>
+          <w:lang w:val="en-GB"/>
+        </w:rPr>
+        <w:t>This automation ensures the relay is switched off at midnight every day regardless of its current state, preventing any connected device from remaining on overnight. The trigger is a fixed time of 00:00:00. There are no conditions. The action calls switch.turn_off targeting Smart Relay 1. The automation was tested using the Run Actions function in the automation editor, which manually triggered the action and confirmed the relay switched off and the LED turned off immediately.</w:t>
+      </w:r>
+    </w:p>
+    <w:p>
+      <w:pPr>
+        <w:jc w:val="left"/>
+        <w:rPr>
+          <w:rFonts w:ascii="Times New Roman" w:hAnsi="Times New Roman" w:eastAsia="Times New Roman" w:cs="Times New Roman"/>
+          <w:noProof w:val="0"/>
+          <w:sz w:val="22"/>
+          <w:szCs w:val="22"/>
+          <w:lang w:val="en-GB"/>
+        </w:rPr>
+      </w:pPr>
+      <w:r>
+        <w:drawing>
+          <wp:inline wp14:editId="47FBA112" wp14:anchorId="33E29301">
+            <wp:extent cx="6162675" cy="3275463"/>
+            <wp:effectExtent l="0" t="0" r="0" b="0"/>
+            <wp:docPr id="158232708" name="drawing"/>
+            <wp:cNvGraphicFramePr>
+              <a:graphicFrameLocks noChangeAspect="1"/>
+            </wp:cNvGraphicFramePr>
+            <a:graphic>
+              <a:graphicData xmlns:a="http://schemas.openxmlformats.org/drawingml/2006/main" uri="http://schemas.openxmlformats.org/drawingml/2006/picture">
+                <pic:pic xmlns:pic="http://schemas.openxmlformats.org/drawingml/2006/picture">
+                  <pic:nvPicPr>
+                    <pic:cNvPr id="158232708" name="Picture 158232708"/>
+                    <pic:cNvPicPr/>
+                  </pic:nvPicPr>
+                  <pic:blipFill>
+                    <a:blip xmlns:r="http://schemas.openxmlformats.org/officeDocument/2006/relationships" r:embed="rId1349706975">
+                      <a:extLst>
+                        <a:ext uri="{28A0092B-C50C-407E-A947-70E740481C1C}">
+                          <a14:useLocalDpi xmlns:a14="http://schemas.microsoft.com/office/drawing/2010/main"/>
+                        </a:ext>
+                      </a:extLst>
+                    </a:blip>
+                    <a:stretch>
+                      <a:fillRect/>
+                    </a:stretch>
+                  </pic:blipFill>
+                  <pic:spPr>
+                    <a:xfrm rot="0">
+                      <a:off x="0" y="0"/>
+                      <a:ext cx="6162675" cy="3275463"/>
+                    </a:xfrm>
+                    <a:prstGeom prst="rect">
+                      <a:avLst/>
+                    </a:prstGeom>
+                  </pic:spPr>
+                </pic:pic>
+              </a:graphicData>
+            </a:graphic>
+          </wp:inline>
+        </w:drawing>
+      </w:r>
+    </w:p>
+    <w:p>
+      <w:pPr>
+        <w:jc w:val="left"/>
+        <w:rPr>
+          <w:rFonts w:ascii="Times New Roman" w:hAnsi="Times New Roman" w:eastAsia="Times New Roman" w:cs="Times New Roman"/>
+          <w:noProof w:val="0"/>
+          <w:sz w:val="22"/>
+          <w:szCs w:val="22"/>
+          <w:lang w:val="en-GB"/>
+        </w:rPr>
+      </w:pPr>
+    </w:p>
+    <w:p>
+      <w:pPr>
+        <w:pStyle w:val="Normal"/>
+        <w:suppressLineNumbers w:val="0"/>
+        <w:bidi w:val="0"/>
+        <w:spacing w:before="0" w:beforeAutospacing="off" w:after="160" w:afterAutospacing="off" w:line="279" w:lineRule="auto"/>
+        <w:ind w:left="0" w:right="0"/>
+        <w:jc w:val="left"/>
+      </w:pPr>
+      <w:r>
+        <w:rPr>
+          <w:rFonts w:ascii="Times New Roman" w:hAnsi="Times New Roman" w:eastAsia="Times New Roman" w:cs="Times New Roman"/>
+          <w:i w:val="1"/>
+          <w:iCs w:val="1"/>
+          <w:noProof w:val="0"/>
+          <w:sz w:val="22"/>
+          <w:szCs w:val="22"/>
+          <w:lang w:val="en-GB"/>
+        </w:rPr>
+        <w:t>[</w:t>
+      </w:r>
+      <w:r>
+        <w:rPr>
+          <w:rFonts w:ascii="Times New Roman" w:hAnsi="Times New Roman" w:eastAsia="Times New Roman" w:cs="Times New Roman"/>
+          <w:i w:val="1"/>
+          <w:iCs w:val="1"/>
+          <w:noProof w:val="0"/>
+          <w:sz w:val="22"/>
+          <w:szCs w:val="22"/>
+          <w:lang w:val="en-GB"/>
+        </w:rPr>
+        <w:t>Figure 16</w:t>
+      </w:r>
+      <w:r>
+        <w:rPr>
+          <w:rFonts w:ascii="Times New Roman" w:hAnsi="Times New Roman" w:eastAsia="Times New Roman" w:cs="Times New Roman"/>
+          <w:i w:val="1"/>
+          <w:iCs w:val="1"/>
+          <w:noProof w:val="0"/>
+          <w:sz w:val="22"/>
+          <w:szCs w:val="22"/>
+          <w:lang w:val="en-GB"/>
+        </w:rPr>
+        <w:t>— Automation 4 configuration showing midnight trigger]</w:t>
+      </w:r>
+    </w:p>
+    <w:p>
+      <w:pPr>
+        <w:jc w:val="left"/>
+      </w:pPr>
+      <w:r>
+        <w:rPr>
+          <w:rFonts w:ascii="Times New Roman" w:hAnsi="Times New Roman" w:eastAsia="Times New Roman" w:cs="Times New Roman"/>
+          <w:b w:val="1"/>
+          <w:bCs w:val="1"/>
+          <w:noProof w:val="0"/>
+          <w:sz w:val="22"/>
+          <w:szCs w:val="22"/>
+          <w:lang w:val="en-GB"/>
+        </w:rPr>
+        <w:t>Automation 5 — Vision AI Person Alert</w:t>
+      </w:r>
+    </w:p>
+    <w:p>
+      <w:pPr>
+        <w:jc w:val="left"/>
+      </w:pPr>
+      <w:r>
+        <w:rPr>
+          <w:rFonts w:ascii="Times New Roman" w:hAnsi="Times New Roman" w:eastAsia="Times New Roman" w:cs="Times New Roman"/>
+          <w:noProof w:val="0"/>
+          <w:sz w:val="22"/>
+          <w:szCs w:val="22"/>
+          <w:lang w:val="en-GB"/>
+        </w:rPr>
+        <w:t>This automation triggers when the Grove Vision AI V2 detects a person, sending an immediate push notification with the message "Person detected by Vision AI camera!" This differs from the PIR motion alert in that it specifically confirms human presence through machine learning inference rather than general heat and motion detection. Together with Automation 3, this creates a two-layer detection system where PIR provides general occupancy awareness and Vision AI provides confirmed human presence identification.</w:t>
+      </w:r>
+    </w:p>
+    <w:p>
+      <w:pPr>
+        <w:jc w:val="left"/>
+        <w:rPr>
+          <w:rFonts w:ascii="Times New Roman" w:hAnsi="Times New Roman" w:eastAsia="Times New Roman" w:cs="Times New Roman"/>
+          <w:noProof w:val="0"/>
+          <w:sz w:val="22"/>
+          <w:szCs w:val="22"/>
+          <w:lang w:val="en-GB"/>
+        </w:rPr>
+      </w:pPr>
+      <w:r>
+        <w:drawing>
+          <wp:inline wp14:editId="62ADF31E" wp14:anchorId="7216D03A">
+            <wp:extent cx="6146332" cy="2914650"/>
+            <wp:effectExtent l="0" t="0" r="0" b="0"/>
+            <wp:docPr id="199884166" name="drawing"/>
+            <wp:cNvGraphicFramePr>
+              <a:graphicFrameLocks noChangeAspect="1"/>
+            </wp:cNvGraphicFramePr>
+            <a:graphic>
+              <a:graphicData xmlns:a="http://schemas.openxmlformats.org/drawingml/2006/main" uri="http://schemas.openxmlformats.org/drawingml/2006/picture">
+                <pic:pic xmlns:pic="http://schemas.openxmlformats.org/drawingml/2006/picture">
+                  <pic:nvPicPr>
+                    <pic:cNvPr id="199884166" name="Picture 199884166"/>
+                    <pic:cNvPicPr/>
+                  </pic:nvPicPr>
+                  <pic:blipFill>
+                    <a:blip xmlns:r="http://schemas.openxmlformats.org/officeDocument/2006/relationships" r:embed="rId1677316301">
+                      <a:extLst>
+                        <a:ext uri="{28A0092B-C50C-407E-A947-70E740481C1C}">
+                          <a14:useLocalDpi xmlns:a14="http://schemas.microsoft.com/office/drawing/2010/main"/>
+                        </a:ext>
+                      </a:extLst>
+                    </a:blip>
+                    <a:stretch>
+                      <a:fillRect/>
+                    </a:stretch>
+                  </pic:blipFill>
+                  <pic:spPr>
+                    <a:xfrm rot="0">
+                      <a:off x="0" y="0"/>
+                      <a:ext cx="6146332" cy="2914650"/>
+                    </a:xfrm>
+                    <a:prstGeom prst="rect">
+                      <a:avLst/>
+                    </a:prstGeom>
+                  </pic:spPr>
+                </pic:pic>
+              </a:graphicData>
+            </a:graphic>
+          </wp:inline>
+        </w:drawing>
+      </w:r>
+    </w:p>
+    <w:p>
+      <w:pPr>
+        <w:jc w:val="left"/>
+        <w:rPr>
+          <w:rFonts w:ascii="Times New Roman" w:hAnsi="Times New Roman" w:eastAsia="Times New Roman" w:cs="Times New Roman"/>
+          <w:i w:val="1"/>
+          <w:iCs w:val="1"/>
+          <w:noProof w:val="0"/>
+          <w:sz w:val="22"/>
+          <w:szCs w:val="22"/>
+          <w:lang w:val="en-GB"/>
+        </w:rPr>
+      </w:pPr>
+      <w:r>
+        <w:rPr>
+          <w:rFonts w:ascii="Times New Roman" w:hAnsi="Times New Roman" w:eastAsia="Times New Roman" w:cs="Times New Roman"/>
+          <w:i w:val="1"/>
+          <w:iCs w:val="1"/>
+          <w:noProof w:val="0"/>
+          <w:sz w:val="22"/>
+          <w:szCs w:val="22"/>
+          <w:lang w:val="en-GB"/>
+        </w:rPr>
+        <w:t>[</w:t>
+      </w:r>
+      <w:r>
+        <w:rPr>
+          <w:rFonts w:ascii="Times New Roman" w:hAnsi="Times New Roman" w:eastAsia="Times New Roman" w:cs="Times New Roman"/>
+          <w:i w:val="1"/>
+          <w:iCs w:val="1"/>
+          <w:noProof w:val="0"/>
+          <w:sz w:val="22"/>
+          <w:szCs w:val="22"/>
+          <w:lang w:val="en-GB"/>
+        </w:rPr>
+        <w:t>Figure 17</w:t>
+      </w:r>
+      <w:r>
+        <w:rPr>
+          <w:rFonts w:ascii="Times New Roman" w:hAnsi="Times New Roman" w:eastAsia="Times New Roman" w:cs="Times New Roman"/>
+          <w:i w:val="1"/>
+          <w:iCs w:val="1"/>
+          <w:noProof w:val="0"/>
+          <w:sz w:val="22"/>
+          <w:szCs w:val="22"/>
+          <w:lang w:val="en-GB"/>
+        </w:rPr>
+        <w:t xml:space="preserve"> — Automation 5 configuration showing Vision AI trigger]</w:t>
+      </w:r>
+    </w:p>
+    <w:p>
+      <w:pPr>
+        <w:jc w:val="left"/>
+      </w:pPr>
+    </w:p>
+    <w:p>
+      <w:pPr>
+        <w:jc w:val="left"/>
+      </w:pPr>
+      <w:r>
+        <w:rPr>
+          <w:rFonts w:ascii="Times New Roman" w:hAnsi="Times New Roman" w:eastAsia="Times New Roman" w:cs="Times New Roman"/>
+          <w:b w:val="1"/>
+          <w:bCs w:val="1"/>
+          <w:noProof w:val="0"/>
+          <w:sz w:val="22"/>
+          <w:szCs w:val="22"/>
+          <w:lang w:val="en-GB"/>
+        </w:rPr>
+        <w:t>4.8 Dashboard Implementation</w:t>
+      </w:r>
+    </w:p>
+    <w:p>
+      <w:pPr>
+        <w:jc w:val="left"/>
+      </w:pPr>
+      <w:r>
+        <w:rPr>
+          <w:rFonts w:ascii="Times New Roman" w:hAnsi="Times New Roman" w:eastAsia="Times New Roman" w:cs="Times New Roman"/>
+          <w:noProof w:val="0"/>
+          <w:sz w:val="22"/>
+          <w:szCs w:val="22"/>
+          <w:lang w:val="en-GB"/>
+        </w:rPr>
+        <w:t>The Smart Home Controller Lovelace dashboard was built to provide a unified, real-time view of all system components accessible from any browser on the local network and from the Waveshare touchscreen in kiosk mode.</w:t>
+      </w:r>
+    </w:p>
+    <w:p>
+      <w:pPr>
+        <w:jc w:val="left"/>
+      </w:pPr>
+      <w:r>
+        <w:rPr>
+          <w:rFonts w:ascii="Times New Roman" w:hAnsi="Times New Roman" w:eastAsia="Times New Roman" w:cs="Times New Roman"/>
+          <w:noProof w:val="0"/>
+          <w:sz w:val="22"/>
+          <w:szCs w:val="22"/>
+          <w:lang w:val="en-GB"/>
+        </w:rPr>
+        <w:t>The dashboard is organised into three sections for clarity. The Sensors section displays the ESP32 Temperature gauge, BH1750 Light Sensor tile, PIR Motion Sensor tile, and Vision AI Person Detection tile, providing a complete overview of all environmental and occupancy data in one place. The Device Control section contains toggle cards for Smart Relay 1 and Smart Relay 2, allowing manual switching of connected devices directly from the dashboard without requiring automation triggers. The Information section displays the Met.no weather forecast card and a clock card showing the current time and date.</w:t>
+      </w:r>
+    </w:p>
+    <w:p>
+      <w:pPr>
+        <w:jc w:val="left"/>
+      </w:pPr>
+      <w:r>
+        <w:rPr>
+          <w:rFonts w:ascii="Times New Roman" w:hAnsi="Times New Roman" w:eastAsia="Times New Roman" w:cs="Times New Roman"/>
+          <w:noProof w:val="0"/>
+          <w:sz w:val="22"/>
+          <w:szCs w:val="22"/>
+          <w:lang w:val="en-GB"/>
+        </w:rPr>
+        <w:t>The dashboard was tested from three interfaces: a laptop browser at homeassistant.local:8123, the Home Assistant mobile app on a phone, and the Waveshare 4.3 inch touchscreen in kiosk mode. All cards loaded correctly and updated in real time across all three interfaces, confirming the multi-interface requirement of the thesis title is fully met. A screenshot of the final dashboard is shown in Figure 18.</w:t>
+      </w:r>
+    </w:p>
+    <w:p>
+      <w:pPr>
+        <w:jc w:val="left"/>
+        <w:rPr>
+          <w:rFonts w:ascii="Times New Roman" w:hAnsi="Times New Roman" w:eastAsia="Times New Roman" w:cs="Times New Roman"/>
+          <w:noProof w:val="0"/>
+          <w:sz w:val="22"/>
+          <w:szCs w:val="22"/>
+          <w:lang w:val="en-GB"/>
+        </w:rPr>
+      </w:pPr>
+      <w:r>
+        <w:drawing>
+          <wp:inline wp14:editId="60712316" wp14:anchorId="2C94A75D">
+            <wp:extent cx="5810250" cy="3209925"/>
+            <wp:effectExtent l="0" t="0" r="0" b="0"/>
+            <wp:docPr id="1715948239" name="drawing"/>
+            <wp:cNvGraphicFramePr>
+              <a:graphicFrameLocks noChangeAspect="1"/>
+            </wp:cNvGraphicFramePr>
+            <a:graphic>
+              <a:graphicData xmlns:a="http://schemas.openxmlformats.org/drawingml/2006/main" uri="http://schemas.openxmlformats.org/drawingml/2006/picture">
+                <pic:pic xmlns:pic="http://schemas.openxmlformats.org/drawingml/2006/picture">
+                  <pic:nvPicPr>
+                    <pic:cNvPr id="1715948239" name="Picture 1715948239"/>
+                    <pic:cNvPicPr/>
+                  </pic:nvPicPr>
+                  <pic:blipFill>
+                    <a:blip xmlns:r="http://schemas.openxmlformats.org/officeDocument/2006/relationships" r:embed="rId785787318">
+                      <a:extLst>
+                        <a:ext uri="{28A0092B-C50C-407E-A947-70E740481C1C}">
+                          <a14:useLocalDpi xmlns:a14="http://schemas.microsoft.com/office/drawing/2010/main"/>
+                        </a:ext>
+                      </a:extLst>
+                    </a:blip>
+                    <a:stretch>
+                      <a:fillRect/>
+                    </a:stretch>
+                  </pic:blipFill>
+                  <pic:spPr>
+                    <a:xfrm rot="0">
+                      <a:off x="0" y="0"/>
+                      <a:ext cx="5810250" cy="3209925"/>
+                    </a:xfrm>
+                    <a:prstGeom prst="rect">
+                      <a:avLst/>
+                    </a:prstGeom>
+                  </pic:spPr>
+                </pic:pic>
+              </a:graphicData>
+            </a:graphic>
+          </wp:inline>
+        </w:drawing>
+      </w:r>
+    </w:p>
+    <w:p>
+      <w:pPr>
+        <w:jc w:val="left"/>
+        <w:rPr>
+          <w:rFonts w:ascii="Times New Roman" w:hAnsi="Times New Roman" w:eastAsia="Times New Roman" w:cs="Times New Roman"/>
+          <w:noProof w:val="0"/>
+          <w:sz w:val="22"/>
+          <w:szCs w:val="22"/>
+          <w:lang w:val="en-GB"/>
+        </w:rPr>
+      </w:pPr>
+    </w:p>
+    <w:p>
+      <w:pPr>
+        <w:jc w:val="left"/>
+        <w:rPr>
+          <w:rFonts w:ascii="Times New Roman" w:hAnsi="Times New Roman" w:eastAsia="Times New Roman" w:cs="Times New Roman"/>
+          <w:i w:val="1"/>
+          <w:iCs w:val="1"/>
+          <w:noProof w:val="0"/>
+          <w:sz w:val="22"/>
+          <w:szCs w:val="22"/>
+          <w:lang w:val="en-GB"/>
+        </w:rPr>
+      </w:pPr>
+      <w:r>
+        <w:rPr>
+          <w:rFonts w:ascii="Times New Roman" w:hAnsi="Times New Roman" w:eastAsia="Times New Roman" w:cs="Times New Roman"/>
+          <w:i w:val="1"/>
+          <w:iCs w:val="1"/>
+          <w:noProof w:val="0"/>
+          <w:sz w:val="22"/>
+          <w:szCs w:val="22"/>
+          <w:lang w:val="en-GB"/>
+        </w:rPr>
+        <w:t>[</w:t>
+      </w:r>
+      <w:r>
+        <w:rPr>
+          <w:rFonts w:ascii="Times New Roman" w:hAnsi="Times New Roman" w:eastAsia="Times New Roman" w:cs="Times New Roman"/>
+          <w:i w:val="1"/>
+          <w:iCs w:val="1"/>
+          <w:noProof w:val="0"/>
+          <w:sz w:val="22"/>
+          <w:szCs w:val="22"/>
+          <w:lang w:val="en-GB"/>
+        </w:rPr>
+        <w:t>Figure 18</w:t>
+      </w:r>
+      <w:r>
+        <w:rPr>
+          <w:rFonts w:ascii="Times New Roman" w:hAnsi="Times New Roman" w:eastAsia="Times New Roman" w:cs="Times New Roman"/>
+          <w:i w:val="1"/>
+          <w:iCs w:val="1"/>
+          <w:noProof w:val="0"/>
+          <w:sz w:val="22"/>
+          <w:szCs w:val="22"/>
+          <w:lang w:val="en-GB"/>
+        </w:rPr>
+        <w:t xml:space="preserve"> — Complete Smart Home Controller dashboard showing all cards]</w:t>
+      </w:r>
+    </w:p>
+    <w:p>
+      <w:pPr>
+        <w:jc w:val="left"/>
+      </w:pPr>
+      <w:r>
+        <w:rPr>
+          <w:rFonts w:ascii="Times New Roman" w:hAnsi="Times New Roman" w:eastAsia="Times New Roman" w:cs="Times New Roman"/>
+          <w:noProof w:val="0"/>
+          <w:sz w:val="22"/>
+          <w:szCs w:val="22"/>
+          <w:lang w:val="en-GB"/>
+        </w:rPr>
+        <w:t>The relay switch cards were tested by toggling Smart Relay 1 from the dashboard, which immediately triggered the relay click and lit the connected LED, confirming bidirectional MQTT communication between Home Assistant and the ESP32. The Vision AI detection card was observed updating from Clear to Detected when a person entered the camera frame and returning to Clear automatically after 5 seconds of no detection.</w:t>
+      </w:r>
+    </w:p>
+    <w:p>
+      <w:pPr>
+        <w:jc w:val="left"/>
+      </w:pPr>
+    </w:p>
+    <w:p>
+      <w:pPr>
+        <w:jc w:val="left"/>
+      </w:pPr>
+      <w:r>
+        <w:rPr>
+          <w:rFonts w:ascii="Times New Roman" w:hAnsi="Times New Roman" w:eastAsia="Times New Roman" w:cs="Times New Roman"/>
+          <w:b w:val="1"/>
+          <w:bCs w:val="1"/>
+          <w:noProof w:val="0"/>
+          <w:sz w:val="22"/>
+          <w:szCs w:val="22"/>
+          <w:lang w:val="en-GB"/>
+        </w:rPr>
+        <w:t>4.9 Challenges and Solutions</w:t>
+      </w:r>
+    </w:p>
+    <w:p>
+      <w:pPr>
+        <w:jc w:val="left"/>
+      </w:pPr>
+      <w:r>
+        <w:rPr>
+          <w:rFonts w:ascii="Times New Roman" w:hAnsi="Times New Roman" w:eastAsia="Times New Roman" w:cs="Times New Roman"/>
+          <w:noProof w:val="0"/>
+          <w:sz w:val="22"/>
+          <w:szCs w:val="22"/>
+          <w:lang w:val="en-GB"/>
+        </w:rPr>
+        <w:t>Several technical challenges were encountered during the implementation of the smart home system. Each challenge is documented here along with the solution applied, as these problem-solving experiences form an important part of the engineering process.</w:t>
+      </w:r>
+    </w:p>
+    <w:p>
+      <w:pPr>
+        <w:jc w:val="left"/>
+      </w:pPr>
+      <w:r>
+        <w:rPr>
+          <w:rFonts w:ascii="Times New Roman" w:hAnsi="Times New Roman" w:eastAsia="Times New Roman" w:cs="Times New Roman"/>
+          <w:b w:val="1"/>
+          <w:bCs w:val="1"/>
+          <w:noProof w:val="0"/>
+          <w:sz w:val="22"/>
+          <w:szCs w:val="22"/>
+          <w:lang w:val="en-GB"/>
+        </w:rPr>
+        <w:t>Challenge 1 — Home Assistant Add-on Store Not Visible</w:t>
+      </w:r>
+    </w:p>
+    <w:p>
+      <w:pPr>
+        <w:jc w:val="left"/>
+      </w:pPr>
+      <w:r>
+        <w:rPr>
+          <w:rFonts w:ascii="Times New Roman" w:hAnsi="Times New Roman" w:eastAsia="Times New Roman" w:cs="Times New Roman"/>
+          <w:noProof w:val="0"/>
+          <w:sz w:val="22"/>
+          <w:szCs w:val="22"/>
+          <w:lang w:val="en-GB"/>
+        </w:rPr>
+        <w:t>After installing Home Assistant OS, the Add-ons section did not appear in the Settings menu. Research revealed that the Add-on store had been renamed to Apps in Home Assistant 2026. Navigating to Settings → Apps resolved the issue and allowed the Mosquitto broker and other add-ons to be installed successfully.</w:t>
+      </w:r>
+    </w:p>
+    <w:p>
+      <w:pPr>
+        <w:jc w:val="left"/>
+      </w:pPr>
+      <w:r>
+        <w:rPr>
+          <w:rFonts w:ascii="Times New Roman" w:hAnsi="Times New Roman" w:eastAsia="Times New Roman" w:cs="Times New Roman"/>
+          <w:b w:val="1"/>
+          <w:bCs w:val="1"/>
+          <w:noProof w:val="0"/>
+          <w:sz w:val="22"/>
+          <w:szCs w:val="22"/>
+          <w:lang w:val="en-GB"/>
+        </w:rPr>
+        <w:t>Challenge 2 — ESP32 Boot Mode Error During Upload</w:t>
+      </w:r>
+    </w:p>
+    <w:p>
+      <w:pPr>
+        <w:jc w:val="left"/>
+      </w:pPr>
+      <w:r>
+        <w:rPr>
+          <w:rFonts w:ascii="Times New Roman" w:hAnsi="Times New Roman" w:eastAsia="Times New Roman" w:cs="Times New Roman"/>
+          <w:noProof w:val="0"/>
+          <w:sz w:val="22"/>
+          <w:szCs w:val="22"/>
+          <w:lang w:val="en-GB"/>
+        </w:rPr>
+        <w:t>When uploading sketches to the ESP32, a "Wrong boot mode detected" error appeared. This was resolved by holding the BOOT button on the ESP32 during the upload process, forcing the chip into download mode before releasing it once the upload began.</w:t>
+      </w:r>
+    </w:p>
+    <w:p>
+      <w:pPr>
+        <w:jc w:val="left"/>
+      </w:pPr>
+      <w:r>
+        <w:rPr>
+          <w:rFonts w:ascii="Times New Roman" w:hAnsi="Times New Roman" w:eastAsia="Times New Roman" w:cs="Times New Roman"/>
+          <w:b w:val="1"/>
+          <w:bCs w:val="1"/>
+          <w:noProof w:val="0"/>
+          <w:sz w:val="22"/>
+          <w:szCs w:val="22"/>
+          <w:lang w:val="en-GB"/>
+        </w:rPr>
+        <w:t>Challenge 3 — PIR Sensor False Readings</w:t>
+      </w:r>
+    </w:p>
+    <w:p>
+      <w:pPr>
+        <w:jc w:val="left"/>
+      </w:pPr>
+      <w:r>
+        <w:rPr>
+          <w:rFonts w:ascii="Times New Roman" w:hAnsi="Times New Roman" w:eastAsia="Times New Roman" w:cs="Times New Roman"/>
+          <w:noProof w:val="0"/>
+          <w:sz w:val="22"/>
+          <w:szCs w:val="22"/>
+          <w:lang w:val="en-GB"/>
+        </w:rPr>
+        <w:t>The HC-SR505 PIR sensor initially appeared faulty, producing no output signal. Systematic debugging confirmed the code and GPIO wiring were correct by manually applying 5V to GPIO 14 and observing the expected Serial Monitor output. The root cause was identified as insufficient warmup time. Adding a 60-second delay in the setup function resolved the issue and the sensor operated reliably thereafter.</w:t>
+      </w:r>
+    </w:p>
+    <w:p>
+      <w:pPr>
+        <w:jc w:val="left"/>
+      </w:pPr>
+      <w:r>
+        <w:rPr>
+          <w:rFonts w:ascii="Times New Roman" w:hAnsi="Times New Roman" w:eastAsia="Times New Roman" w:cs="Times New Roman"/>
+          <w:b w:val="1"/>
+          <w:bCs w:val="1"/>
+          <w:noProof w:val="0"/>
+          <w:sz w:val="22"/>
+          <w:szCs w:val="22"/>
+          <w:lang w:val="en-GB"/>
+        </w:rPr>
+        <w:t>Challenge 4 — GPIO 13 Instability</w:t>
+      </w:r>
+    </w:p>
+    <w:p>
+      <w:pPr>
+        <w:jc w:val="left"/>
+      </w:pPr>
+      <w:r>
+        <w:rPr>
+          <w:rFonts w:ascii="Times New Roman" w:hAnsi="Times New Roman" w:eastAsia="Times New Roman" w:cs="Times New Roman"/>
+          <w:noProof w:val="0"/>
+          <w:sz w:val="22"/>
+          <w:szCs w:val="22"/>
+          <w:lang w:val="en-GB"/>
+        </w:rPr>
+        <w:t>Initial PIR wiring used GPIO 13, which produced inconsistent readings. Switching to GPIO 14 resolved the issue immediately, indicating GPIO 13 had internal conflicts with the ESP32's boot strapping pins.</w:t>
+      </w:r>
+    </w:p>
+    <w:p>
+      <w:pPr>
+        <w:jc w:val="left"/>
+      </w:pPr>
+      <w:r>
+        <w:rPr>
+          <w:rFonts w:ascii="Times New Roman" w:hAnsi="Times New Roman" w:eastAsia="Times New Roman" w:cs="Times New Roman"/>
+          <w:b w:val="1"/>
+          <w:bCs w:val="1"/>
+          <w:noProof w:val="0"/>
+          <w:sz w:val="22"/>
+          <w:szCs w:val="22"/>
+          <w:lang w:val="en-GB"/>
+        </w:rPr>
+        <w:t>Challenge 5 — Relay Module Compatibility</w:t>
+      </w:r>
+    </w:p>
+    <w:p>
+      <w:pPr>
+        <w:jc w:val="left"/>
+      </w:pPr>
+      <w:r>
+        <w:rPr>
+          <w:rFonts w:ascii="Times New Roman" w:hAnsi="Times New Roman" w:eastAsia="Times New Roman" w:cs="Times New Roman"/>
+          <w:noProof w:val="0"/>
+          <w:sz w:val="22"/>
+          <w:szCs w:val="22"/>
+          <w:lang w:val="en-GB"/>
+        </w:rPr>
+        <w:t>The relay module initially provided was an ESP-01 relay board designed for the ESP8266 microcontroller rather than direct ESP32 GPIO control. A standard 2-channel relay module with VCC, GND, and IN pins was sourced as a replacement, allowing direct control from the ESP32 without additional hardware.</w:t>
+      </w:r>
+    </w:p>
+    <w:p>
+      <w:pPr>
+        <w:jc w:val="left"/>
+      </w:pPr>
+      <w:r>
+        <w:rPr>
+          <w:rFonts w:ascii="Times New Roman" w:hAnsi="Times New Roman" w:eastAsia="Times New Roman" w:cs="Times New Roman"/>
+          <w:b w:val="1"/>
+          <w:bCs w:val="1"/>
+          <w:noProof w:val="0"/>
+          <w:sz w:val="22"/>
+          <w:szCs w:val="22"/>
+          <w:lang w:val="en-GB"/>
+        </w:rPr>
+        <w:t>Challenge 6 — Grove Vision AI V2 I2C Connection</w:t>
+      </w:r>
+    </w:p>
+    <w:p>
+      <w:pPr>
+        <w:jc w:val="left"/>
+      </w:pPr>
+      <w:r>
+        <w:rPr>
+          <w:rFonts w:ascii="Times New Roman" w:hAnsi="Times New Roman" w:eastAsia="Times New Roman" w:cs="Times New Roman"/>
+          <w:noProof w:val="0"/>
+          <w:sz w:val="22"/>
+          <w:szCs w:val="22"/>
+          <w:lang w:val="en-GB"/>
+        </w:rPr>
+        <w:t>The Grove Vision AI V2 initially failed to initialize with error code CMD_ETIMEDOUT (result 3). Investigation revealed that the SCL jumper wire had a loose connection in the breadboard, causing intermittent I2C communication failures. Moving the wire to a tighter breadboard hole resolved the connection and the Vision AI V2 initialized successfully. Additionally, the Vision AI V2 required initialization after the WiFi connection was established rather than before, which also contributed to earlier initialization failures.</w:t>
+      </w:r>
+    </w:p>
+    <w:p>
+      <w:pPr>
+        <w:jc w:val="left"/>
+      </w:pPr>
+      <w:r>
+        <w:rPr>
+          <w:rFonts w:ascii="Times New Roman" w:hAnsi="Times New Roman" w:eastAsia="Times New Roman" w:cs="Times New Roman"/>
+          <w:b w:val="1"/>
+          <w:bCs w:val="1"/>
+          <w:noProof w:val="0"/>
+          <w:sz w:val="22"/>
+          <w:szCs w:val="22"/>
+          <w:lang w:val="en-GB"/>
+        </w:rPr>
+        <w:t>Challenge 7 — Relay Active LOW Logic</w:t>
+      </w:r>
+    </w:p>
+    <w:p>
+      <w:pPr>
+        <w:jc w:val="left"/>
+      </w:pPr>
+      <w:r>
+        <w:rPr>
+          <w:rFonts w:ascii="Times New Roman" w:hAnsi="Times New Roman" w:eastAsia="Times New Roman" w:cs="Times New Roman"/>
+          <w:noProof w:val="0"/>
+          <w:sz w:val="22"/>
+          <w:szCs w:val="22"/>
+          <w:lang w:val="en-GB"/>
+        </w:rPr>
+        <w:t>The relay module operates on active LOW logic, meaning GPIO LOW activates the relay and GPIO HIGH deactivates it. Initial wiring used the NC (Normally Closed) terminal instead of NO (Normally Open), causing the LED to be on by default and turn off when the relay activated. Rewiring to the NO terminal and correcting the GPIO logic in the sketch resolved this, giving the expected behaviour of LED off by default and on when the relay is commanded ON.</w:t>
+      </w:r>
+    </w:p>
+    <w:p>
+      <w:pPr>
+        <w:jc w:val="left"/>
+      </w:pPr>
+      <w:r>
+        <w:rPr>
+          <w:rFonts w:ascii="Times New Roman" w:hAnsi="Times New Roman" w:eastAsia="Times New Roman" w:cs="Times New Roman"/>
+          <w:b w:val="1"/>
+          <w:bCs w:val="1"/>
+          <w:noProof w:val="0"/>
+          <w:sz w:val="22"/>
+          <w:szCs w:val="22"/>
+          <w:lang w:val="en-GB"/>
+        </w:rPr>
+        <w:t>Challenge 8 — Vision AI Persistent Detection State</w:t>
+      </w:r>
+    </w:p>
+    <w:p>
+      <w:pPr>
+        <w:jc w:val="left"/>
+      </w:pPr>
+      <w:r>
+        <w:rPr>
+          <w:rFonts w:ascii="Times New Roman" w:hAnsi="Times New Roman" w:eastAsia="Times New Roman" w:cs="Times New Roman"/>
+          <w:noProof w:val="0"/>
+          <w:sz w:val="22"/>
+          <w:szCs w:val="22"/>
+          <w:lang w:val="en-GB"/>
+        </w:rPr>
+        <w:t>After person detection, the Vision AI entity in Home Assistant remained in the Detected state even after the person left the camera frame. This was caused by MQTT retained messages and the invoke function not returning empty boxes when nothing was detected. The solution implemented a 5-second timeout — the system only publishes OFF after 5 consecutive seconds of no detection boxes being returned, preventing false persistent states while also avoiding excessive flickering.</w:t>
+      </w:r>
+    </w:p>
+    <w:p>
+      <w:pPr>
+        <w:jc w:val="left"/>
+        <w:rPr>
+          <w:rFonts w:ascii="Times New Roman" w:hAnsi="Times New Roman" w:eastAsia="Times New Roman" w:cs="Times New Roman"/>
+          <w:noProof w:val="0"/>
+          <w:sz w:val="22"/>
+          <w:szCs w:val="22"/>
+          <w:lang w:val="en-GB"/>
+        </w:rPr>
+      </w:pPr>
+    </w:p>
+    <w:p>
+      <w:pPr>
+        <w:pStyle w:val="Normal"/>
+        <w:spacing w:before="240" w:beforeAutospacing="off" w:after="240" w:afterAutospacing="off"/>
+        <w:jc w:val="left"/>
+      </w:pPr>
+      <w:r>
+        <w:rPr>
+          <w:rFonts w:ascii="Times New Roman" w:hAnsi="Times New Roman" w:eastAsia="Times New Roman" w:cs="Times New Roman"/>
+          <w:noProof w:val="0"/>
+          <w:sz w:val="22"/>
+          <w:szCs w:val="22"/>
+          <w:lang w:val="en-GB"/>
+        </w:rPr>
+        <w:t>CHAPTER 5 | IMPLEMENATION PART 2</w:t>
+      </w:r>
+    </w:p>
+    <w:p>
+      <w:pPr>
+        <w:spacing w:before="240" w:beforeAutospacing="off" w:after="240" w:afterAutospacing="off"/>
+        <w:jc w:val="left"/>
+      </w:pPr>
+      <w:r>
+        <w:rPr>
+          <w:rFonts w:ascii="Times New Roman" w:hAnsi="Times New Roman" w:eastAsia="Times New Roman" w:cs="Times New Roman"/>
+          <w:b w:val="1"/>
+          <w:bCs w:val="1"/>
+          <w:noProof w:val="0"/>
+          <w:sz w:val="22"/>
+          <w:szCs w:val="22"/>
+          <w:lang w:val="en-GB"/>
+        </w:rPr>
+        <w:t>5.1 BH1750 Light Sensor and Relay Module Integration</w:t>
+      </w:r>
+    </w:p>
+    <w:p>
+      <w:pPr>
+        <w:spacing w:before="240" w:beforeAutospacing="off" w:after="240" w:afterAutospacing="off"/>
+        <w:jc w:val="left"/>
+      </w:pPr>
+      <w:r>
+        <w:rPr>
+          <w:rFonts w:ascii="Times New Roman" w:hAnsi="Times New Roman" w:eastAsia="Times New Roman" w:cs="Times New Roman"/>
+          <w:noProof w:val="0"/>
+          <w:sz w:val="22"/>
+          <w:szCs w:val="22"/>
+          <w:lang w:val="en-GB"/>
+        </w:rPr>
+        <w:t>Following the completion of the core sensor system in Phase 1, two additional hardware components were integrated in Phase 2 to extend the system's environmental monitoring and actuation capabilities: the BH1750 ambient light sensor and the 2-channel relay module.</w:t>
+      </w:r>
+    </w:p>
+    <w:p>
+      <w:pPr>
+        <w:spacing w:before="240" w:beforeAutospacing="off" w:after="240" w:afterAutospacing="off"/>
+        <w:jc w:val="left"/>
+      </w:pPr>
+      <w:r>
+        <w:rPr>
+          <w:rFonts w:ascii="Times New Roman" w:hAnsi="Times New Roman" w:eastAsia="Times New Roman" w:cs="Times New Roman"/>
+          <w:noProof w:val="0"/>
+          <w:sz w:val="22"/>
+          <w:szCs w:val="22"/>
+          <w:lang w:val="en-GB"/>
+        </w:rPr>
+        <w:t xml:space="preserve">The BH1750 was wired to the ESP32-WROOM-32 using the I2C protocol on GPIO 21 (SDA) and GPIO 22 (SCL), with VCC connected to the ESP32 3.3V pin and GND to ground. The BH1750 library by Christopher Laws was installed via the Arduino Library Manager. The sensor was initialised using </w:t>
+      </w:r>
+      <w:r>
+        <w:rPr>
+          <w:rFonts w:ascii="Consolas" w:hAnsi="Consolas" w:eastAsia="Consolas" w:cs="Consolas"/>
+          <w:noProof w:val="0"/>
+          <w:sz w:val="22"/>
+          <w:szCs w:val="22"/>
+          <w:lang w:val="en-GB"/>
+        </w:rPr>
+        <w:t>Wire.begin(21, 22)</w:t>
+      </w:r>
+      <w:r>
+        <w:rPr>
+          <w:rFonts w:ascii="Times New Roman" w:hAnsi="Times New Roman" w:eastAsia="Times New Roman" w:cs="Times New Roman"/>
+          <w:noProof w:val="0"/>
+          <w:sz w:val="22"/>
+          <w:szCs w:val="22"/>
+          <w:lang w:val="en-GB"/>
+        </w:rPr>
+        <w:t xml:space="preserve"> and </w:t>
+      </w:r>
+      <w:r>
+        <w:rPr>
+          <w:rFonts w:ascii="Consolas" w:hAnsi="Consolas" w:eastAsia="Consolas" w:cs="Consolas"/>
+          <w:noProof w:val="0"/>
+          <w:sz w:val="22"/>
+          <w:szCs w:val="22"/>
+          <w:lang w:val="en-GB"/>
+        </w:rPr>
+        <w:t>lightMeter.begin()</w:t>
+      </w:r>
+      <w:r>
+        <w:rPr>
+          <w:rFonts w:ascii="Times New Roman" w:hAnsi="Times New Roman" w:eastAsia="Times New Roman" w:cs="Times New Roman"/>
+          <w:noProof w:val="0"/>
+          <w:sz w:val="22"/>
+          <w:szCs w:val="22"/>
+          <w:lang w:val="en-GB"/>
+        </w:rPr>
+        <w:t xml:space="preserve"> in the setup function. Initial readings confirmed accurate ambient light detection at approximately 75-120 lux indoors, dropping to near zero when the sensor was covered. The sensor publishes calibrated lux values to Home Assistant via MQTT autodiscovery under the topic </w:t>
+      </w:r>
+      <w:r>
+        <w:rPr>
+          <w:rFonts w:ascii="Consolas" w:hAnsi="Consolas" w:eastAsia="Consolas" w:cs="Consolas"/>
+          <w:noProof w:val="0"/>
+          <w:sz w:val="22"/>
+          <w:szCs w:val="22"/>
+          <w:lang w:val="en-GB"/>
+        </w:rPr>
+        <w:t>home/esp32/light</w:t>
+      </w:r>
+      <w:r>
+        <w:rPr>
+          <w:rFonts w:ascii="Times New Roman" w:hAnsi="Times New Roman" w:eastAsia="Times New Roman" w:cs="Times New Roman"/>
+          <w:noProof w:val="0"/>
+          <w:sz w:val="22"/>
+          <w:szCs w:val="22"/>
+          <w:lang w:val="en-GB"/>
+        </w:rPr>
+        <w:t>, creating a BH1750 Light Sensor entity automatically.</w:t>
+      </w:r>
+    </w:p>
+    <w:p>
+      <w:pPr>
+        <w:spacing w:before="240" w:beforeAutospacing="off" w:after="240" w:afterAutospacing="off"/>
+        <w:jc w:val="left"/>
+      </w:pPr>
+      <w:r>
+        <w:rPr>
+          <w:rFonts w:ascii="Times New Roman" w:hAnsi="Times New Roman" w:eastAsia="Times New Roman" w:cs="Times New Roman"/>
+          <w:noProof w:val="0"/>
+          <w:sz w:val="22"/>
+          <w:szCs w:val="22"/>
+          <w:lang w:val="en-GB"/>
+        </w:rPr>
+        <w:t>The 2-channel relay module (JQC3F 05VDC) was wired with VCC and RY-VCC connected to the ESP32 VIN (5V) pin via the breadboard power rail, GND to ground, IN1 to GPIO 26, and IN2 to GPIO 27. The relay operates on active LOW logic, meaning a LOW signal on the control pin activates the relay and a HIGH signal deactivates it. This was confirmed during testing when initial wiring to the NC (Normally Closed) terminal caused the LED to be on by default — rewiring to the NO (Normally Open) terminal and correcting the GPIO logic resolved this. A red LED with a 220 ohm resistor was connected to relay channel 1 via the COM and NO screw terminals to provide visual confirmation of relay switching. Both relay channels subscribe to MQTT command topics and publish their state back to Home Assistant, enabling bidirectional control from the dashboard.</w:t>
+      </w:r>
+    </w:p>
+    <w:p>
+      <w:pPr>
+        <w:spacing w:before="240" w:beforeAutospacing="off" w:after="240" w:afterAutospacing="off"/>
+        <w:jc w:val="left"/>
+      </w:pPr>
+      <w:r>
+        <w:rPr>
+          <w:rFonts w:ascii="Times New Roman" w:hAnsi="Times New Roman" w:eastAsia="Times New Roman" w:cs="Times New Roman"/>
+          <w:noProof w:val="0"/>
+          <w:sz w:val="22"/>
+          <w:szCs w:val="22"/>
+          <w:lang w:val="en-GB"/>
+        </w:rPr>
+        <w:t>A photo of the complete breadboard wiring including BH1750 and relay module is shown in Figure 19.</w:t>
+      </w:r>
+    </w:p>
+    <w:p>
+      <w:pPr>
+        <w:spacing w:before="240" w:beforeAutospacing="off" w:after="240" w:afterAutospacing="off"/>
+        <w:jc w:val="left"/>
+        <w:rPr>
+          <w:rFonts w:ascii="Times New Roman" w:hAnsi="Times New Roman" w:eastAsia="Times New Roman" w:cs="Times New Roman"/>
+          <w:noProof w:val="0"/>
+          <w:sz w:val="22"/>
+          <w:szCs w:val="22"/>
+          <w:lang w:val="en-GB"/>
+        </w:rPr>
+      </w:pPr>
+      <w:r>
+        <w:drawing>
+          <wp:inline wp14:editId="5CD62A00" wp14:anchorId="74B2C81F">
+            <wp:extent cx="4295775" cy="5724525"/>
+            <wp:effectExtent l="0" t="0" r="0" b="0"/>
+            <wp:docPr id="333819541" name="drawing"/>
+            <wp:cNvGraphicFramePr>
+              <a:graphicFrameLocks noChangeAspect="1"/>
+            </wp:cNvGraphicFramePr>
+            <a:graphic>
+              <a:graphicData xmlns:a="http://schemas.openxmlformats.org/drawingml/2006/main" uri="http://schemas.openxmlformats.org/drawingml/2006/picture">
+                <pic:pic xmlns:pic="http://schemas.openxmlformats.org/drawingml/2006/picture">
+                  <pic:nvPicPr>
+                    <pic:cNvPr id="333819541" name="Picture 333819541"/>
+                    <pic:cNvPicPr/>
+                  </pic:nvPicPr>
+                  <pic:blipFill>
+                    <a:blip xmlns:r="http://schemas.openxmlformats.org/officeDocument/2006/relationships" r:embed="rId721222318">
+                      <a:extLst>
+                        <a:ext uri="{28A0092B-C50C-407E-A947-70E740481C1C}">
+                          <a14:useLocalDpi xmlns:a14="http://schemas.microsoft.com/office/drawing/2010/main"/>
+                        </a:ext>
+                      </a:extLst>
+                    </a:blip>
+                    <a:stretch>
+                      <a:fillRect/>
+                    </a:stretch>
+                  </pic:blipFill>
+                  <pic:spPr>
+                    <a:xfrm>
+                      <a:off x="0" y="0"/>
+                      <a:ext cx="4295775" cy="5724525"/>
+                    </a:xfrm>
+                    <a:prstGeom prst="rect">
+                      <a:avLst/>
+                    </a:prstGeom>
+                  </pic:spPr>
+                </pic:pic>
+              </a:graphicData>
+            </a:graphic>
+          </wp:inline>
+        </w:drawing>
+      </w:r>
+    </w:p>
+    <w:p>
+      <w:pPr>
+        <w:pStyle w:val="Normal"/>
+        <w:suppressLineNumbers w:val="0"/>
+        <w:bidi w:val="0"/>
+        <w:spacing w:before="240" w:beforeAutospacing="off" w:after="240" w:afterAutospacing="off" w:line="279" w:lineRule="auto"/>
+        <w:ind w:left="0" w:right="0"/>
+        <w:jc w:val="left"/>
+      </w:pPr>
+      <w:r>
+        <w:rPr>
+          <w:rFonts w:ascii="Times New Roman" w:hAnsi="Times New Roman" w:eastAsia="Times New Roman" w:cs="Times New Roman"/>
+          <w:i w:val="1"/>
+          <w:iCs w:val="1"/>
+          <w:noProof w:val="0"/>
+          <w:sz w:val="22"/>
+          <w:szCs w:val="22"/>
+          <w:lang w:val="en-GB"/>
+        </w:rPr>
+        <w:t>[</w:t>
+      </w:r>
+      <w:r>
+        <w:rPr>
+          <w:rFonts w:ascii="Times New Roman" w:hAnsi="Times New Roman" w:eastAsia="Times New Roman" w:cs="Times New Roman"/>
+          <w:i w:val="1"/>
+          <w:iCs w:val="1"/>
+          <w:noProof w:val="0"/>
+          <w:sz w:val="22"/>
+          <w:szCs w:val="22"/>
+          <w:lang w:val="en-GB"/>
+        </w:rPr>
+        <w:t>Figure 19</w:t>
+      </w:r>
+      <w:r>
+        <w:rPr>
+          <w:rFonts w:ascii="Times New Roman" w:hAnsi="Times New Roman" w:eastAsia="Times New Roman" w:cs="Times New Roman"/>
+          <w:i w:val="1"/>
+          <w:iCs w:val="1"/>
+          <w:noProof w:val="0"/>
+          <w:sz w:val="22"/>
+          <w:szCs w:val="22"/>
+          <w:lang w:val="en-GB"/>
+        </w:rPr>
+        <w:t xml:space="preserve"> — breadboard showing BH1750 and relay module wired to ESP32]</w:t>
+      </w:r>
+    </w:p>
+    <w:p>
+      <w:pPr>
+        <w:spacing w:before="240" w:beforeAutospacing="off" w:after="240" w:afterAutospacing="off"/>
+        <w:jc w:val="left"/>
+      </w:pPr>
+      <w:r>
+        <w:rPr>
+          <w:rFonts w:ascii="Times New Roman" w:hAnsi="Times New Roman" w:eastAsia="Times New Roman" w:cs="Times New Roman"/>
+          <w:b w:val="1"/>
+          <w:bCs w:val="1"/>
+          <w:noProof w:val="0"/>
+          <w:sz w:val="22"/>
+          <w:szCs w:val="22"/>
+          <w:lang w:val="en-GB"/>
+        </w:rPr>
+        <w:t>5.2 Grove Vision AI V2 Integration</w:t>
+      </w:r>
+    </w:p>
+    <w:p>
+      <w:pPr>
+        <w:spacing w:before="240" w:beforeAutospacing="off" w:after="240" w:afterAutospacing="off"/>
+        <w:jc w:val="left"/>
+      </w:pPr>
+      <w:r>
+        <w:rPr>
+          <w:rFonts w:ascii="Times New Roman" w:hAnsi="Times New Roman" w:eastAsia="Times New Roman" w:cs="Times New Roman"/>
+          <w:noProof w:val="0"/>
+          <w:sz w:val="22"/>
+          <w:szCs w:val="22"/>
+          <w:lang w:val="en-GB"/>
+        </w:rPr>
+        <w:t>The Grove Vision AI V2 module was integrated with the existing ESP32-WROOM-32 microcontroller using the I2C protocol, eliminating the need for a separate ESP32-S3 board. This decision simplified the system architecture by keeping all sensor and AI processing on a single microcontroller.</w:t>
+      </w:r>
+    </w:p>
+    <w:p>
+      <w:pPr>
+        <w:spacing w:before="240" w:beforeAutospacing="off" w:after="240" w:afterAutospacing="off"/>
+        <w:jc w:val="left"/>
+      </w:pPr>
+      <w:r>
+        <w:rPr>
+          <w:rFonts w:ascii="Times New Roman" w:hAnsi="Times New Roman" w:eastAsia="Times New Roman" w:cs="Times New Roman"/>
+          <w:noProof w:val="0"/>
+          <w:sz w:val="22"/>
+          <w:szCs w:val="22"/>
+          <w:lang w:val="en-GB"/>
+        </w:rPr>
+        <w:t>The Raspberry Pi Camera V2 was connected to the Grove Vision AI V2 via the CSI ribbon cable connector on the module board. The person detection model was deployed to the module using the SenseCraft AI web platform at sensecraft.seeed.cc, which provides a no-code interface for selecting and flashing pre-trained AI models. The person detection model based on YOLO architecture was selected and flashed successfully, with live detection confirmed through the SenseCraft web interface before proceeding with ESP32 integration.</w:t>
+      </w:r>
+    </w:p>
+    <w:p>
+      <w:pPr>
+        <w:spacing w:before="240" w:beforeAutospacing="off" w:after="240" w:afterAutospacing="off"/>
+        <w:jc w:val="left"/>
+      </w:pPr>
+      <w:r>
+        <w:rPr>
+          <w:rFonts w:ascii="Times New Roman" w:hAnsi="Times New Roman" w:eastAsia="Times New Roman" w:cs="Times New Roman"/>
+          <w:noProof w:val="0"/>
+          <w:sz w:val="22"/>
+          <w:szCs w:val="22"/>
+          <w:lang w:val="en-GB"/>
+        </w:rPr>
+        <w:t>The Grove Vision AI V2 was wired to the ESP32-WROOM-32 using four jumper wires connected to the module's dual 7-pin header. The 5V pin was connected to the ESP32 VIN via the breadboard power rail, GND to ground, SDA to GPIO 4, and SCL to GPIO 5. A separate I2C bus (Wire1) was used to avoid conflicts with the BH1750 sensor already on Wire (GPIO 21/22). The Seeed Arduino SSCMA library was installed to handle communication with the Vision AI module.</w:t>
+      </w:r>
+    </w:p>
+    <w:p>
+      <w:pPr>
+        <w:spacing w:before="240" w:beforeAutospacing="off" w:after="240" w:afterAutospacing="off"/>
+        <w:jc w:val="left"/>
+      </w:pPr>
+      <w:r>
+        <w:rPr>
+          <w:rFonts w:ascii="Times New Roman" w:hAnsi="Times New Roman" w:eastAsia="Times New Roman" w:cs="Times New Roman"/>
+          <w:noProof w:val="0"/>
+          <w:sz w:val="22"/>
+          <w:szCs w:val="22"/>
+          <w:lang w:val="en-GB"/>
+        </w:rPr>
+        <w:t xml:space="preserve">Initial testing with the I2C scanner confirmed the Grove Vision AI V2 was detected at address 0x62 as shown in Figure 20. However, the module initially failed to initialise when </w:t>
+      </w:r>
+      <w:r>
+        <w:rPr>
+          <w:rFonts w:ascii="Consolas" w:hAnsi="Consolas" w:eastAsia="Consolas" w:cs="Consolas"/>
+          <w:noProof w:val="0"/>
+          <w:sz w:val="22"/>
+          <w:szCs w:val="22"/>
+          <w:lang w:val="en-GB"/>
+        </w:rPr>
+        <w:t>AI.begin()</w:t>
+      </w:r>
+      <w:r>
+        <w:rPr>
+          <w:rFonts w:ascii="Times New Roman" w:hAnsi="Times New Roman" w:eastAsia="Times New Roman" w:cs="Times New Roman"/>
+          <w:noProof w:val="0"/>
+          <w:sz w:val="22"/>
+          <w:szCs w:val="22"/>
+          <w:lang w:val="en-GB"/>
+        </w:rPr>
+        <w:t xml:space="preserve"> was called — investigation revealed two causes: a loose SCL jumper wire in the breadboard causing intermittent connection, and the initialisation being called before the WiFi connection was established. Both issues were resolved by securing the SCL wire and moving the Vision AI initialisation to after the WiFi setup in the code.</w:t>
+      </w:r>
+    </w:p>
+    <w:p>
+      <w:pPr>
+        <w:spacing w:before="240" w:beforeAutospacing="off" w:after="240" w:afterAutospacing="off"/>
+        <w:jc w:val="left"/>
+        <w:rPr>
+          <w:rFonts w:ascii="Times New Roman" w:hAnsi="Times New Roman" w:eastAsia="Times New Roman" w:cs="Times New Roman"/>
+          <w:noProof w:val="0"/>
+          <w:sz w:val="22"/>
+          <w:szCs w:val="22"/>
+          <w:lang w:val="en-GB"/>
+        </w:rPr>
+      </w:pPr>
+      <w:r>
+        <w:drawing>
+          <wp:inline wp14:editId="3A53D582" wp14:anchorId="03D600E3">
+            <wp:extent cx="5724525" cy="3552825"/>
+            <wp:effectExtent l="0" t="0" r="0" b="0"/>
+            <wp:docPr id="62151384" name="drawing"/>
+            <wp:cNvGraphicFramePr>
+              <a:graphicFrameLocks noChangeAspect="1"/>
+            </wp:cNvGraphicFramePr>
+            <a:graphic>
+              <a:graphicData xmlns:a="http://schemas.openxmlformats.org/drawingml/2006/main" uri="http://schemas.openxmlformats.org/drawingml/2006/picture">
+                <pic:pic xmlns:pic="http://schemas.openxmlformats.org/drawingml/2006/picture">
+                  <pic:nvPicPr>
+                    <pic:cNvPr id="62151384" name="Picture 62151384"/>
+                    <pic:cNvPicPr/>
+                  </pic:nvPicPr>
+                  <pic:blipFill>
+                    <a:blip xmlns:r="http://schemas.openxmlformats.org/officeDocument/2006/relationships" r:embed="rId732067915">
+                      <a:extLst>
+                        <a:ext uri="{28A0092B-C50C-407E-A947-70E740481C1C}">
+                          <a14:useLocalDpi xmlns:a14="http://schemas.microsoft.com/office/drawing/2010/main"/>
+                        </a:ext>
+                      </a:extLst>
+                    </a:blip>
+                    <a:stretch>
+                      <a:fillRect/>
+                    </a:stretch>
+                  </pic:blipFill>
+                  <pic:spPr>
+                    <a:xfrm rot="0">
+                      <a:off x="0" y="0"/>
+                      <a:ext cx="5724525" cy="3552825"/>
+                    </a:xfrm>
+                    <a:prstGeom prst="rect">
+                      <a:avLst/>
+                    </a:prstGeom>
+                  </pic:spPr>
+                </pic:pic>
+              </a:graphicData>
+            </a:graphic>
+          </wp:inline>
+        </w:drawing>
+      </w:r>
+    </w:p>
+    <w:p>
+      <w:pPr>
+        <w:pStyle w:val="Normal"/>
+        <w:suppressLineNumbers w:val="0"/>
+        <w:bidi w:val="0"/>
+        <w:spacing w:before="240" w:beforeAutospacing="off" w:after="240" w:afterAutospacing="off" w:line="279" w:lineRule="auto"/>
+        <w:ind w:left="0" w:right="0"/>
+        <w:jc w:val="left"/>
+      </w:pPr>
+      <w:r>
+        <w:rPr>
+          <w:rFonts w:ascii="Times New Roman" w:hAnsi="Times New Roman" w:eastAsia="Times New Roman" w:cs="Times New Roman"/>
+          <w:i w:val="1"/>
+          <w:iCs w:val="1"/>
+          <w:noProof w:val="0"/>
+          <w:sz w:val="22"/>
+          <w:szCs w:val="22"/>
+          <w:lang w:val="en-GB"/>
+        </w:rPr>
+        <w:t>[</w:t>
+      </w:r>
+      <w:r>
+        <w:rPr>
+          <w:rFonts w:ascii="Times New Roman" w:hAnsi="Times New Roman" w:eastAsia="Times New Roman" w:cs="Times New Roman"/>
+          <w:i w:val="1"/>
+          <w:iCs w:val="1"/>
+          <w:noProof w:val="0"/>
+          <w:sz w:val="22"/>
+          <w:szCs w:val="22"/>
+          <w:lang w:val="en-GB"/>
+        </w:rPr>
+        <w:t xml:space="preserve">Figure 20 </w:t>
+      </w:r>
+      <w:r>
+        <w:rPr>
+          <w:rFonts w:ascii="Times New Roman" w:hAnsi="Times New Roman" w:eastAsia="Times New Roman" w:cs="Times New Roman"/>
+          <w:i w:val="1"/>
+          <w:iCs w:val="1"/>
+          <w:noProof w:val="0"/>
+          <w:sz w:val="22"/>
+          <w:szCs w:val="22"/>
+          <w:lang w:val="en-GB"/>
+        </w:rPr>
+        <w:t>— I2C scanner showing 0x62 detected]</w:t>
+      </w:r>
+    </w:p>
+    <w:p>
+      <w:pPr>
+        <w:spacing w:before="240" w:beforeAutospacing="off" w:after="240" w:afterAutospacing="off"/>
+        <w:jc w:val="left"/>
+      </w:pPr>
+      <w:r>
+        <w:rPr>
+          <w:rFonts w:ascii="Times New Roman" w:hAnsi="Times New Roman" w:eastAsia="Times New Roman" w:cs="Times New Roman"/>
+          <w:noProof w:val="0"/>
+          <w:sz w:val="22"/>
+          <w:szCs w:val="22"/>
+          <w:lang w:val="en-GB"/>
+        </w:rPr>
+        <w:t>After resolving these issues, person detection was confirmed working with confidence scores of 77-89% when a person was in the camera frame as shown in Figure 21. The module correctly returned empty detection results when no person was present, and a 5-second timeout was implemented to prevent the Home Assistant entity from remaining in the Detected state after a person left the frame.</w:t>
+      </w:r>
+    </w:p>
+    <w:p>
+      <w:pPr>
+        <w:spacing w:before="240" w:beforeAutospacing="off" w:after="240" w:afterAutospacing="off"/>
+        <w:jc w:val="left"/>
+        <w:rPr>
+          <w:rFonts w:ascii="Times New Roman" w:hAnsi="Times New Roman" w:eastAsia="Times New Roman" w:cs="Times New Roman"/>
+          <w:noProof w:val="0"/>
+          <w:sz w:val="22"/>
+          <w:szCs w:val="22"/>
+          <w:lang w:val="en-GB"/>
+        </w:rPr>
+      </w:pPr>
+      <w:r>
+        <w:drawing>
+          <wp:inline wp14:editId="1FAC59BD" wp14:anchorId="70E1D487">
+            <wp:extent cx="5724525" cy="3419475"/>
+            <wp:effectExtent l="0" t="0" r="0" b="0"/>
+            <wp:docPr id="621626585" name="drawing"/>
+            <wp:cNvGraphicFramePr>
+              <a:graphicFrameLocks noChangeAspect="1"/>
+            </wp:cNvGraphicFramePr>
+            <a:graphic>
+              <a:graphicData xmlns:a="http://schemas.openxmlformats.org/drawingml/2006/main" uri="http://schemas.openxmlformats.org/drawingml/2006/picture">
+                <pic:pic xmlns:pic="http://schemas.openxmlformats.org/drawingml/2006/picture">
+                  <pic:nvPicPr>
+                    <pic:cNvPr id="621626585" name="Picture 621626585"/>
+                    <pic:cNvPicPr/>
+                  </pic:nvPicPr>
+                  <pic:blipFill>
+                    <a:blip xmlns:r="http://schemas.openxmlformats.org/officeDocument/2006/relationships" r:embed="rId334411858">
+                      <a:extLst>
+                        <a:ext uri="{28A0092B-C50C-407E-A947-70E740481C1C}">
+                          <a14:useLocalDpi xmlns:a14="http://schemas.microsoft.com/office/drawing/2010/main"/>
+                        </a:ext>
+                      </a:extLst>
+                    </a:blip>
+                    <a:stretch>
+                      <a:fillRect/>
+                    </a:stretch>
+                  </pic:blipFill>
+                  <pic:spPr>
+                    <a:xfrm rot="0">
+                      <a:off x="0" y="0"/>
+                      <a:ext cx="5724525" cy="3419475"/>
+                    </a:xfrm>
+                    <a:prstGeom prst="rect">
+                      <a:avLst/>
+                    </a:prstGeom>
+                  </pic:spPr>
+                </pic:pic>
+              </a:graphicData>
+            </a:graphic>
+          </wp:inline>
+        </w:drawing>
+      </w:r>
+    </w:p>
+    <w:p>
+      <w:pPr>
+        <w:spacing w:before="240" w:beforeAutospacing="off" w:after="240" w:afterAutospacing="off"/>
+        <w:jc w:val="left"/>
+        <w:rPr>
+          <w:rFonts w:ascii="Times New Roman" w:hAnsi="Times New Roman" w:eastAsia="Times New Roman" w:cs="Times New Roman"/>
+          <w:i w:val="1"/>
+          <w:iCs w:val="1"/>
+          <w:noProof w:val="0"/>
+          <w:sz w:val="22"/>
+          <w:szCs w:val="22"/>
+          <w:lang w:val="en-GB"/>
+        </w:rPr>
+      </w:pPr>
+      <w:r>
+        <w:rPr>
+          <w:rFonts w:ascii="Times New Roman" w:hAnsi="Times New Roman" w:eastAsia="Times New Roman" w:cs="Times New Roman"/>
+          <w:i w:val="1"/>
+          <w:iCs w:val="1"/>
+          <w:noProof w:val="0"/>
+          <w:sz w:val="22"/>
+          <w:szCs w:val="22"/>
+          <w:lang w:val="en-GB"/>
+        </w:rPr>
+        <w:t>[</w:t>
+      </w:r>
+      <w:r>
+        <w:rPr>
+          <w:rFonts w:ascii="Times New Roman" w:hAnsi="Times New Roman" w:eastAsia="Times New Roman" w:cs="Times New Roman"/>
+          <w:i w:val="1"/>
+          <w:iCs w:val="1"/>
+          <w:noProof w:val="0"/>
+          <w:sz w:val="22"/>
+          <w:szCs w:val="22"/>
+          <w:lang w:val="en-GB"/>
+        </w:rPr>
+        <w:t>Figure 21</w:t>
+      </w:r>
+      <w:r>
+        <w:rPr>
+          <w:rFonts w:ascii="Times New Roman" w:hAnsi="Times New Roman" w:eastAsia="Times New Roman" w:cs="Times New Roman"/>
+          <w:i w:val="1"/>
+          <w:iCs w:val="1"/>
+          <w:noProof w:val="0"/>
+          <w:sz w:val="22"/>
+          <w:szCs w:val="22"/>
+          <w:lang w:val="en-GB"/>
+        </w:rPr>
+        <w:t>— Serial Monitor showing Person detected! Score: 89]</w:t>
+      </w:r>
+    </w:p>
+    <w:p>
+      <w:pPr>
+        <w:spacing w:before="240" w:beforeAutospacing="off" w:after="240" w:afterAutospacing="off"/>
+        <w:jc w:val="left"/>
+      </w:pPr>
+      <w:r>
+        <w:rPr>
+          <w:rFonts w:ascii="Times New Roman" w:hAnsi="Times New Roman" w:eastAsia="Times New Roman" w:cs="Times New Roman"/>
+          <w:b w:val="1"/>
+          <w:bCs w:val="1"/>
+          <w:noProof w:val="0"/>
+          <w:sz w:val="22"/>
+          <w:szCs w:val="22"/>
+          <w:lang w:val="en-GB"/>
+        </w:rPr>
+        <w:t>5.3 Vision AI Automation in Home Assistant</w:t>
+      </w:r>
+    </w:p>
+    <w:p>
+      <w:pPr>
+        <w:spacing w:before="240" w:beforeAutospacing="off" w:after="240" w:afterAutospacing="off"/>
+        <w:jc w:val="left"/>
+      </w:pPr>
+      <w:r>
+        <w:rPr>
+          <w:rFonts w:ascii="Times New Roman" w:hAnsi="Times New Roman" w:eastAsia="Times New Roman" w:cs="Times New Roman"/>
+          <w:noProof w:val="0"/>
+          <w:sz w:val="22"/>
+          <w:szCs w:val="22"/>
+          <w:lang w:val="en-GB"/>
+        </w:rPr>
+        <w:t>The Grove Vision AI V2 integration with Home Assistant was completed by adding the Vision AI Person Detection binary sensor entity to the system and building a dedicated automation.</w:t>
+      </w:r>
+    </w:p>
+    <w:p>
+      <w:pPr>
+        <w:spacing w:before="240" w:beforeAutospacing="off" w:after="240" w:afterAutospacing="off"/>
+        <w:jc w:val="left"/>
+      </w:pPr>
+      <w:r>
+        <w:rPr>
+          <w:rFonts w:ascii="Times New Roman" w:hAnsi="Times New Roman" w:eastAsia="Times New Roman" w:cs="Times New Roman"/>
+          <w:noProof w:val="0"/>
+          <w:sz w:val="22"/>
+          <w:szCs w:val="22"/>
+          <w:lang w:val="en-GB"/>
+        </w:rPr>
+        <w:t xml:space="preserve">The entity was created automatically through MQTT autodiscovery when the combined ESP32 sketch published the discovery payload to </w:t>
+      </w:r>
+      <w:r>
+        <w:rPr>
+          <w:rFonts w:ascii="Consolas" w:hAnsi="Consolas" w:eastAsia="Consolas" w:cs="Consolas"/>
+          <w:noProof w:val="0"/>
+          <w:sz w:val="22"/>
+          <w:szCs w:val="22"/>
+          <w:lang w:val="en-GB"/>
+        </w:rPr>
+        <w:t>homeassistant/binary_sensor/visionai/config</w:t>
+      </w:r>
+      <w:r>
+        <w:rPr>
+          <w:rFonts w:ascii="Times New Roman" w:hAnsi="Times New Roman" w:eastAsia="Times New Roman" w:cs="Times New Roman"/>
+          <w:noProof w:val="0"/>
+          <w:sz w:val="22"/>
+          <w:szCs w:val="22"/>
+          <w:lang w:val="en-GB"/>
+        </w:rPr>
+        <w:t>. The entity uses device class occupancy, publishing ON when a person is detected with confidence above 60% and OFF after 5 seconds of no detection. The 60% confidence threshold was implemented to filter low-confidence false positives while maintaining reliable detection of actual persons in the camera frame.</w:t>
+      </w:r>
+    </w:p>
+    <w:p>
+      <w:pPr>
+        <w:pStyle w:val="Normal"/>
+        <w:spacing w:before="240" w:beforeAutospacing="off" w:after="240" w:afterAutospacing="off"/>
+        <w:jc w:val="left"/>
+      </w:pPr>
+      <w:r>
+        <w:rPr>
+          <w:rFonts w:ascii="Times New Roman" w:hAnsi="Times New Roman" w:eastAsia="Times New Roman" w:cs="Times New Roman"/>
+          <w:noProof w:val="0"/>
+          <w:sz w:val="22"/>
+          <w:szCs w:val="22"/>
+          <w:lang w:val="en-GB"/>
+        </w:rPr>
+        <w:t>Automation 5 — Vision AI Person Alert — was configured to send a push notification to the registered mobile device when the Vision AI Person Detection entity changes to Detected</w:t>
+      </w:r>
+      <w:r>
+        <w:rPr>
+          <w:rFonts w:ascii="Times New Roman" w:hAnsi="Times New Roman" w:eastAsia="Times New Roman" w:cs="Times New Roman"/>
+          <w:noProof w:val="0"/>
+          <w:sz w:val="22"/>
+          <w:szCs w:val="22"/>
+          <w:lang w:val="en-GB"/>
+        </w:rPr>
+        <w:t>, as shown in Figure 17 in Chapter 4.7</w:t>
+      </w:r>
+      <w:r>
+        <w:rPr>
+          <w:rFonts w:ascii="Times New Roman" w:hAnsi="Times New Roman" w:eastAsia="Times New Roman" w:cs="Times New Roman"/>
+          <w:noProof w:val="0"/>
+          <w:sz w:val="22"/>
+          <w:szCs w:val="22"/>
+          <w:lang w:val="en-GB"/>
+        </w:rPr>
+        <w:t>. The notification message reads "Person detected by Vision AI camera!" distinguishing it from the PIR-based motion alert. This creates a two-layer detection system: the PIR sensor provides general occupancy awareness based on infrared heat signatures, while the Vision AI module provides confirmed human presence identification through machine learning inference. Together these two sensors reduce false positive alerts compared to using either sensor alone.</w:t>
+      </w:r>
+    </w:p>
+    <w:p>
+      <w:pPr>
+        <w:jc w:val="left"/>
+        <w:rPr>
+          <w:rFonts w:ascii="Times New Roman" w:hAnsi="Times New Roman" w:eastAsia="Times New Roman" w:cs="Times New Roman"/>
+          <w:noProof w:val="0"/>
+          <w:sz w:val="22"/>
+          <w:szCs w:val="22"/>
+          <w:lang w:val="en-GB"/>
+        </w:rPr>
+      </w:pPr>
+    </w:p>
+    <w:p>
+      <w:pPr>
+        <w:jc w:val="left"/>
+        <w:rPr>
+          <w:rFonts w:ascii="Times New Roman" w:hAnsi="Times New Roman" w:eastAsia="Times New Roman" w:cs="Times New Roman"/>
+          <w:noProof w:val="0"/>
+          <w:sz w:val="22"/>
+          <w:szCs w:val="22"/>
+          <w:lang w:val="en-GB"/>
+        </w:rPr>
+      </w:pPr>
+    </w:p>
+    <w:p>
+      <w:pPr>
+        <w:jc w:val="left"/>
+        <w:rPr>
+          <w:rFonts w:ascii="Times New Roman" w:hAnsi="Times New Roman" w:eastAsia="Times New Roman" w:cs="Times New Roman"/>
+          <w:noProof w:val="0"/>
+          <w:sz w:val="22"/>
+          <w:szCs w:val="22"/>
+          <w:lang w:val="en-GB"/>
+        </w:rPr>
+      </w:pPr>
+    </w:p>
+    <w:p>
+      <w:pPr>
+        <w:jc w:val="left"/>
+        <w:rPr>
+          <w:rFonts w:ascii="Times New Roman" w:hAnsi="Times New Roman" w:eastAsia="Times New Roman" w:cs="Times New Roman"/>
+          <w:noProof w:val="0"/>
+          <w:sz w:val="22"/>
+          <w:szCs w:val="22"/>
+          <w:lang w:val="en-GB"/>
+        </w:rPr>
+      </w:pPr>
     </w:p>
     <w:p>
       <w:pPr>

</xml_diff>